<commit_message>
feat: polish release UI and harden deployment
</commit_message>
<xml_diff>
--- a/competition/gemastik-2026/deliverables/07_Adopsi_Lisensi_HAWK-EYE.docx
+++ b/competition/gemastik-2026/deliverables/07_Adopsi_Lisensi_HAWK-EYE.docx
@@ -2,201 +2,217 @@
 <file path=word/document.xml><?xml version="1.0" encoding="utf-8"?>
 <w:document xmlns:wpc="http://schemas.microsoft.com/office/word/2010/wordprocessingCanvas" xmlns:mo="http://schemas.microsoft.com/office/mac/office/2008/main" xmlns:mc="http://schemas.openxmlformats.org/markup-compatibility/2006" xmlns:mv="urn:schemas-microsoft-com:mac:vml" xmlns:o="urn:schemas-microsoft-com:office:office" xmlns:r="http://schemas.openxmlformats.org/officeDocument/2006/relationships" xmlns:m="http://schemas.openxmlformats.org/officeDocument/2006/math" xmlns:v="urn:schemas-microsoft-com:vml" xmlns:wp14="http://schemas.microsoft.com/office/word/2010/wordprocessingDrawing" xmlns:wp="http://schemas.openxmlformats.org/drawingml/2006/wordprocessingDrawing" xmlns:w10="urn:schemas-microsoft-com:office:word" xmlns:w="http://schemas.openxmlformats.org/wordprocessingml/2006/main" xmlns:w14="http://schemas.microsoft.com/office/word/2010/wordml" xmlns:wpg="http://schemas.microsoft.com/office/word/2010/wordprocessingGroup" xmlns:wpi="http://schemas.microsoft.com/office/word/2010/wordprocessingInk" xmlns:wne="http://schemas.microsoft.com/office/word/2006/wordml" xmlns:wps="http://schemas.microsoft.com/office/word/2010/wordprocessingShape" mc:Ignorable="w14 wp14">
   <w:body>
-    <w:tbl>
-      <w:tblPr>
-        <w:tblW w:type="auto" w:w="0"/>
-        <w:jc w:val="center"/>
-        <w:tblLayout w:type="fixed"/>
-        <w:tblLook w:firstColumn="1" w:firstRow="1" w:lastColumn="0" w:lastRow="0" w:noHBand="0" w:noVBand="1" w:val="04A0"/>
-      </w:tblPr>
-      <w:tblGrid>
-        <w:gridCol w:w="7056"/>
-        <w:gridCol w:w="2736"/>
-      </w:tblGrid>
-      <w:tr>
-        <w:trPr>
-          <w:tblHeader w:val="true"/>
-        </w:trPr>
-        <w:tc>
-          <w:tcPr>
-            <w:tcW w:type="dxa" w:w="4997"/>
-            <w:shd w:fill="071724"/>
-            <w:tcMar>
-              <w:top w:w="180" w:type="dxa"/>
-              <w:start w:w="240" w:type="dxa"/>
-              <w:bottom w:w="180" w:type="dxa"/>
-              <w:end w:w="80" w:type="dxa"/>
-            </w:tcMar>
-            <w:vAlign w:val="center"/>
-          </w:tcPr>
-          <w:p>
-            <w:pPr>
-              <w:spacing w:after="20"/>
-            </w:pPr>
-            <w:r>
-              <w:rPr>
-                <w:b/>
-                <w:color w:val="FFFFFF"/>
-                <w:sz w:val="36"/>
-              </w:rPr>
-              <w:t>HAWK-EYE</w:t>
-            </w:r>
-          </w:p>
-          <w:p>
-            <w:pPr>
-              <w:spacing w:after="0"/>
-            </w:pPr>
-            <w:r>
-              <w:rPr>
-                <w:b/>
-                <w:color w:val="8BB7D0"/>
-                <w:sz w:val="15"/>
-              </w:rPr>
-              <w:t>ALAT INVESTIGASI EKOSISTEM JUDI ONLINE</w:t>
-            </w:r>
-          </w:p>
-        </w:tc>
-        <w:tc>
-          <w:tcPr>
-            <w:tcW w:type="dxa" w:w="4997"/>
-            <w:shd w:fill="071724"/>
-            <w:tcMar>
-              <w:top w:w="100" w:type="dxa"/>
-              <w:start w:w="80" w:type="dxa"/>
-              <w:bottom w:w="100" w:type="dxa"/>
-              <w:end w:w="160" w:type="dxa"/>
-            </w:tcMar>
-            <w:vAlign w:val="center"/>
-          </w:tcPr>
-          <w:p>
-            <w:pPr>
-              <w:jc w:val="right"/>
-            </w:pPr>
-            <w:r>
-              <w:drawing>
-                <wp:inline xmlns:a="http://schemas.openxmlformats.org/drawingml/2006/main" xmlns:pic="http://schemas.openxmlformats.org/drawingml/2006/picture">
-                  <wp:extent cx="868680" cy="868680"/>
-                  <wp:docPr id="1" name="Picture 1" title="Logo HAWK-EYE" descr="Ikon burung elang HAWK-EYE berwarna hitam dan magenta."/>
-                  <wp:cNvGraphicFramePr>
-                    <a:graphicFrameLocks noChangeAspect="1"/>
-                  </wp:cNvGraphicFramePr>
-                  <a:graphic>
-                    <a:graphicData uri="http://schemas.openxmlformats.org/drawingml/2006/picture">
-                      <pic:pic>
-                        <pic:nvPicPr>
-                          <pic:cNvPr id="0" name="hawkeye-avatar.png"/>
-                          <pic:cNvPicPr/>
-                        </pic:nvPicPr>
-                        <pic:blipFill>
-                          <a:blip r:embed="rId9"/>
-                          <a:stretch>
-                            <a:fillRect/>
-                          </a:stretch>
-                        </pic:blipFill>
-                        <pic:spPr>
-                          <a:xfrm>
-                            <a:off x="0" y="0"/>
-                            <a:ext cx="868680" cy="868680"/>
-                          </a:xfrm>
-                          <a:prstGeom prst="rect"/>
-                        </pic:spPr>
-                      </pic:pic>
-                    </a:graphicData>
-                  </a:graphic>
-                </wp:inline>
-              </w:drawing>
-            </w:r>
-          </w:p>
-        </w:tc>
-      </w:tr>
-    </w:tbl>
-    <w:tbl>
-      <w:tblPr>
-        <w:tblW w:type="auto" w:w="0"/>
-        <w:jc w:val="center"/>
-        <w:tblLook w:firstColumn="1" w:firstRow="1" w:lastColumn="0" w:lastRow="0" w:noHBand="0" w:noVBand="1" w:val="04A0"/>
-      </w:tblPr>
-      <w:tblGrid>
-        <w:gridCol w:w="9994"/>
-      </w:tblGrid>
-      <w:tr>
-        <w:trPr>
-          <w:tblHeader w:val="true"/>
-        </w:trPr>
-        <w:tc>
-          <w:tcPr>
-            <w:tcW w:type="dxa" w:w="9965"/>
-            <w:shd w:fill="EC0A6B"/>
-            <w:tcMar>
-              <w:top w:w="18" w:type="dxa"/>
-              <w:start w:w="0" w:type="dxa"/>
-              <w:bottom w:w="18" w:type="dxa"/>
-              <w:end w:w="0" w:type="dxa"/>
-            </w:tcMar>
-          </w:tcPr>
-          <w:p>
-            <w:pPr>
-              <w:spacing w:after="0"/>
-            </w:pPr>
-          </w:p>
-        </w:tc>
-      </w:tr>
-    </w:tbl>
-    <w:p>
-      <w:pPr>
-        <w:spacing w:after="560"/>
-      </w:pPr>
-    </w:p>
+    <w:p/>
+    <w:p/>
+    <w:p/>
+    <w:p/>
     <w:p>
       <w:pPr>
         <w:spacing w:after="240"/>
+        <w:jc w:val="center"/>
       </w:pPr>
       <w:r>
         <w:rPr>
+          <w:rFonts w:ascii="Times New Roman" w:hAnsi="Times New Roman" w:eastAsia="Times New Roman" w:cs="Times New Roman"/>
           <w:b/>
-          <w:color w:val="EC0A6B"/>
-          <w:sz w:val="20"/>
+          <w:i w:val="0"/>
+          <w:color w:val="000000"/>
+          <w:sz w:val="30"/>
         </w:rPr>
-        <w:t>GEMASTIK 2026  /  AL-07</w:t>
+        <w:t>DOKUMEN PENDUKUNG</w:t>
       </w:r>
     </w:p>
     <w:p>
       <w:pPr>
-        <w:keepNext/>
-        <w:spacing w:after="160"/>
+        <w:spacing w:after="600"/>
+        <w:jc w:val="center"/>
       </w:pPr>
       <w:r>
         <w:rPr>
+          <w:rFonts w:ascii="Times New Roman" w:hAnsi="Times New Roman" w:eastAsia="Times New Roman" w:cs="Times New Roman"/>
           <w:b/>
-          <w:color w:val="071724"/>
-          <w:sz w:val="60"/>
+          <w:i w:val="0"/>
+          <w:color w:val="000000"/>
+          <w:sz w:val="28"/>
         </w:rPr>
-        <w:t>Adopsi Lisensi</w:t>
+        <w:t>GEMASTIK XIX 2026</w:t>
+        <w:br/>
+        <w:t>PENGEMBANGAN PERANGKAT LUNAK</w:t>
       </w:r>
     </w:p>
     <w:p>
       <w:pPr>
-        <w:spacing w:after="280"/>
+        <w:spacing w:after="200"/>
+        <w:jc w:val="center"/>
       </w:pPr>
       <w:r>
         <w:rPr>
-          <w:color w:val="1F4D78"/>
-          <w:sz w:val="30"/>
+          <w:rFonts w:ascii="Times New Roman" w:hAnsi="Times New Roman" w:eastAsia="Times New Roman" w:cs="Times New Roman"/>
+          <w:b/>
+          <w:i w:val="0"/>
+          <w:color w:val="000000"/>
+          <w:sz w:val="32"/>
+        </w:rPr>
+        <w:t>ADOPSI LISENSI PERANGKAT LUNAK</w:t>
+      </w:r>
+    </w:p>
+    <w:p>
+      <w:pPr>
+        <w:spacing w:after="600"/>
+        <w:jc w:val="center"/>
+      </w:pPr>
+      <w:r>
+        <w:rPr>
+          <w:rFonts w:ascii="Times New Roman" w:hAnsi="Times New Roman" w:eastAsia="Times New Roman" w:cs="Times New Roman"/>
+          <w:b/>
+          <w:i w:val="0"/>
+          <w:color w:val="000000"/>
+          <w:sz w:val="26"/>
         </w:rPr>
         <w:t>MIT License untuk karya asli HAWK-EYE</w:t>
       </w:r>
     </w:p>
     <w:p>
       <w:pPr>
-        <w:spacing w:after="840"/>
+        <w:spacing w:after="80"/>
+        <w:jc w:val="center"/>
       </w:pPr>
       <w:r>
         <w:rPr>
+          <w:rFonts w:ascii="Times New Roman" w:hAnsi="Times New Roman" w:eastAsia="Times New Roman" w:cs="Times New Roman"/>
           <w:b/>
-          <w:color w:val="EC0A6B"/>
-          <w:sz w:val="21"/>
+          <w:i w:val="0"/>
+          <w:color w:val="000000"/>
+          <w:sz w:val="28"/>
         </w:rPr>
-        <w:t>Tanggal berlaku 13 Agustus 2026</w:t>
+        <w:t>HAWK-EYE — JUDOLGRAPH</w:t>
+      </w:r>
+    </w:p>
+    <w:p>
+      <w:pPr>
+        <w:jc w:val="center"/>
+      </w:pPr>
+      <w:r>
+        <w:rPr>
+          <w:rFonts w:ascii="Times New Roman" w:hAnsi="Times New Roman" w:eastAsia="Times New Roman" w:cs="Times New Roman"/>
+          <w:b w:val="0"/>
+          <w:i w:val="0"/>
+          <w:color w:val="000000"/>
+          <w:sz w:val="24"/>
+        </w:rPr>
+        <w:t>Alat Investigasi Ekosistem Judi Online</w:t>
+      </w:r>
+    </w:p>
+    <w:p/>
+    <w:p/>
+    <w:p/>
+    <w:p/>
+    <w:p/>
+    <w:p>
+      <w:pPr>
+        <w:spacing w:after="80"/>
+        <w:jc w:val="center"/>
+      </w:pPr>
+      <w:r>
+        <w:rPr>
+          <w:rFonts w:ascii="Times New Roman" w:hAnsi="Times New Roman" w:eastAsia="Times New Roman" w:cs="Times New Roman"/>
+          <w:b/>
+          <w:i w:val="0"/>
+          <w:color w:val="000000"/>
+          <w:sz w:val="28"/>
+        </w:rPr>
+        <w:t>UNIVERSITAS DIPONEGORO</w:t>
+      </w:r>
+    </w:p>
+    <w:p>
+      <w:pPr>
+        <w:jc w:val="center"/>
+      </w:pPr>
+      <w:r>
+        <w:rPr>
+          <w:rFonts w:ascii="Times New Roman" w:hAnsi="Times New Roman" w:eastAsia="Times New Roman" w:cs="Times New Roman"/>
+          <w:b/>
+          <w:i w:val="0"/>
+          <w:color w:val="000000"/>
+          <w:sz w:val="28"/>
+        </w:rPr>
+        <w:t>2026</w:t>
+      </w:r>
+    </w:p>
+    <w:p>
+      <w:pPr>
+        <w:sectPr>
+          <w:headerReference w:type="default" r:id="rId11"/>
+          <w:footerReference w:type="default" r:id="rId12"/>
+          <w:pgSz w:w="11906" w:h="16838"/>
+          <w:pgMar w:top="1417" w:right="1417" w:bottom="1417" w:left="1417" w:header="709" w:footer="709" w:gutter="0"/>
+          <w:cols w:space="720"/>
+          <w:docGrid w:linePitch="360"/>
+        </w:sectPr>
+      </w:pPr>
+    </w:p>
+    <w:p>
+      <w:pPr>
+        <w:pStyle w:val="Heading1"/>
+      </w:pPr>
+      <w:r>
+        <w:rPr>
+          <w:rFonts w:ascii="Times New Roman" w:hAnsi="Times New Roman" w:eastAsia="Times New Roman" w:cs="Times New Roman"/>
+          <w:b w:val="0"/>
+          <w:i w:val="0"/>
+          <w:color w:val="000000"/>
+          <w:sz w:val="24"/>
+        </w:rPr>
+        <w:t>1. Pengertian dan Dasar Adopsi Lisensi</w:t>
+      </w:r>
+    </w:p>
+    <w:p>
+      <w:pPr>
+        <w:spacing w:line="360" w:lineRule="auto" w:after="0"/>
+        <w:ind w:firstLine="425"/>
+        <w:jc w:val="both"/>
+      </w:pPr>
+      <w:r>
+        <w:rPr>
+          <w:rFonts w:ascii="Times New Roman" w:hAnsi="Times New Roman" w:eastAsia="Times New Roman" w:cs="Times New Roman"/>
+          <w:b w:val="0"/>
+          <w:i w:val="0"/>
+          <w:color w:val="000000"/>
+          <w:sz w:val="24"/>
+        </w:rPr>
+        <w:t>Lisensi perangkat lunak adalah ketentuan yang mengatur hak dan kewajiban dalam menggunakan, menyalin, memodifikasi, dan mendistribusikan perangkat lunak. Lisensi diperlukan agar pengguna mengetahui tindakan yang diizinkan, syarat yang harus dipenuhi, serta batas tanggung jawab pemegang hak cipta.</w:t>
+      </w:r>
+    </w:p>
+    <w:p>
+      <w:pPr>
+        <w:spacing w:line="360" w:lineRule="auto" w:after="0"/>
+        <w:ind w:firstLine="425"/>
+        <w:jc w:val="both"/>
+      </w:pPr>
+      <w:r>
+        <w:rPr>
+          <w:rFonts w:ascii="Times New Roman" w:hAnsi="Times New Roman" w:eastAsia="Times New Roman" w:cs="Times New Roman"/>
+          <w:b w:val="0"/>
+          <w:i w:val="0"/>
+          <w:color w:val="000000"/>
+          <w:sz w:val="24"/>
+        </w:rPr>
+        <w:t>Pada HAWK-EYE, adopsi lisensi juga membedakan karya asli tim dari library, runtime, font, ikon, browser, data, dan materi pihak ketiga. Lisensi proyek hanya berlaku pada bagian yang haknya dimiliki kontributor HAWK-EYE. Komponen pihak ketiga tetap mengikuti lisensi sumbernya masing-masing.</w:t>
+      </w:r>
+    </w:p>
+    <w:p>
+      <w:pPr>
+        <w:pStyle w:val="Heading1"/>
+      </w:pPr>
+      <w:r>
+        <w:rPr>
+          <w:rFonts w:ascii="Times New Roman" w:hAnsi="Times New Roman" w:eastAsia="Times New Roman" w:cs="Times New Roman"/>
+          <w:b w:val="0"/>
+          <w:i w:val="0"/>
+          <w:color w:val="000000"/>
+          <w:sz w:val="24"/>
+        </w:rPr>
+        <w:t>2. Identitas Perangkat Lunak</w:t>
       </w:r>
     </w:p>
     <w:tbl>
@@ -205,60 +221,73 @@
         <w:jc w:val="left"/>
         <w:tblLayout w:type="fixed"/>
         <w:tblLook w:firstColumn="1" w:firstRow="1" w:lastColumn="0" w:lastRow="0" w:noHBand="0" w:noVBand="1" w:val="04A0"/>
+        <w:tblBorders>
+          <w:top w:val="single" w:sz="4" w:color="B7B7B7"/>
+          <w:left w:val="single" w:sz="4" w:color="B7B7B7"/>
+          <w:bottom w:val="single" w:sz="4" w:color="B7B7B7"/>
+          <w:right w:val="single" w:sz="4" w:color="B7B7B7"/>
+          <w:insideH w:val="single" w:sz="4" w:color="B7B7B7"/>
+          <w:insideV w:val="single" w:sz="4" w:color="B7B7B7"/>
+        </w:tblBorders>
       </w:tblPr>
       <w:tblGrid>
-        <w:gridCol w:w="4997"/>
-        <w:gridCol w:w="4997"/>
+        <w:gridCol w:w="2381"/>
+        <w:gridCol w:w="6803"/>
       </w:tblGrid>
       <w:tr>
-        <w:trPr>
-          <w:tblHeader w:val="true"/>
-        </w:trPr>
         <w:tc>
           <w:tcPr>
-            <w:tcW w:type="dxa" w:w="1944"/>
-            <w:shd w:fill="E8EEF5"/>
+            <w:tcW w:type="dxa" w:w="2381"/>
+            <w:vAlign w:val="top"/>
+            <w:shd w:fill="FFFFFF"/>
             <w:tcMar>
-              <w:top w:w="90" w:type="dxa"/>
-              <w:start w:w="120" w:type="dxa"/>
-              <w:bottom w:w="90" w:type="dxa"/>
-              <w:end w:w="120" w:type="dxa"/>
+              <w:top w:w="70" w:type="dxa"/>
+              <w:start w:w="90" w:type="dxa"/>
+              <w:bottom w:w="70" w:type="dxa"/>
+              <w:end w:w="90" w:type="dxa"/>
             </w:tcMar>
-            <w:vAlign w:val="center"/>
           </w:tcPr>
           <w:p>
             <w:pPr>
-              <w:spacing w:after="0"/>
+              <w:ind w:firstLine="0"/>
+              <w:jc w:val="left"/>
             </w:pPr>
             <w:r>
               <w:rPr>
+                <w:rFonts w:ascii="Times New Roman" w:hAnsi="Times New Roman" w:eastAsia="Times New Roman" w:cs="Times New Roman"/>
                 <w:b/>
-                <w:color w:val="1F4D78"/>
-                <w:sz w:val="17"/>
+                <w:i w:val="0"/>
+                <w:color w:val="000000"/>
+                <w:sz w:val="22"/>
               </w:rPr>
-              <w:t>PRODUK</w:t>
+              <w:t>Nama perangkat lunak</w:t>
             </w:r>
           </w:p>
         </w:tc>
         <w:tc>
           <w:tcPr>
-            <w:tcW w:type="dxa" w:w="7416"/>
+            <w:tcW w:type="dxa" w:w="6803"/>
+            <w:vAlign w:val="top"/>
+            <w:shd w:fill="FFFFFF"/>
             <w:tcMar>
-              <w:top w:w="90" w:type="dxa"/>
-              <w:start w:w="120" w:type="dxa"/>
-              <w:bottom w:w="90" w:type="dxa"/>
-              <w:end w:w="120" w:type="dxa"/>
+              <w:top w:w="70" w:type="dxa"/>
+              <w:start w:w="90" w:type="dxa"/>
+              <w:bottom w:w="70" w:type="dxa"/>
+              <w:end w:w="90" w:type="dxa"/>
             </w:tcMar>
-            <w:vAlign w:val="center"/>
           </w:tcPr>
           <w:p>
             <w:pPr>
-              <w:spacing w:after="0"/>
+              <w:ind w:firstLine="0"/>
+              <w:jc w:val="left"/>
             </w:pPr>
             <w:r>
               <w:rPr>
-                <w:color w:val="071724"/>
-                <w:sz w:val="19"/>
+                <w:rFonts w:ascii="Times New Roman" w:hAnsi="Times New Roman" w:eastAsia="Times New Roman" w:cs="Times New Roman"/>
+                <w:b w:val="0"/>
+                <w:i w:val="0"/>
+                <w:color w:val="000000"/>
+                <w:sz w:val="22"/>
               </w:rPr>
               <w:t>HAWK-EYE — JudolGraph</w:t>
             </w:r>
@@ -268,49 +297,57 @@
       <w:tr>
         <w:tc>
           <w:tcPr>
-            <w:tcW w:type="dxa" w:w="1944"/>
-            <w:shd w:fill="E8EEF5"/>
+            <w:tcW w:type="dxa" w:w="2381"/>
+            <w:vAlign w:val="top"/>
+            <w:shd w:fill="FFFFFF"/>
             <w:tcMar>
-              <w:top w:w="90" w:type="dxa"/>
-              <w:start w:w="120" w:type="dxa"/>
-              <w:bottom w:w="90" w:type="dxa"/>
-              <w:end w:w="120" w:type="dxa"/>
+              <w:top w:w="70" w:type="dxa"/>
+              <w:start w:w="90" w:type="dxa"/>
+              <w:bottom w:w="70" w:type="dxa"/>
+              <w:end w:w="90" w:type="dxa"/>
             </w:tcMar>
-            <w:vAlign w:val="center"/>
           </w:tcPr>
           <w:p>
             <w:pPr>
-              <w:spacing w:after="0"/>
+              <w:ind w:firstLine="0"/>
+              <w:jc w:val="left"/>
             </w:pPr>
             <w:r>
               <w:rPr>
+                <w:rFonts w:ascii="Times New Roman" w:hAnsi="Times New Roman" w:eastAsia="Times New Roman" w:cs="Times New Roman"/>
                 <w:b/>
-                <w:color w:val="1F4D78"/>
-                <w:sz w:val="17"/>
+                <w:i w:val="0"/>
+                <w:color w:val="000000"/>
+                <w:sz w:val="22"/>
               </w:rPr>
-              <w:t>VERSI</w:t>
+              <w:t>Versi</w:t>
             </w:r>
           </w:p>
         </w:tc>
         <w:tc>
           <w:tcPr>
-            <w:tcW w:type="dxa" w:w="7416"/>
+            <w:tcW w:type="dxa" w:w="6803"/>
+            <w:vAlign w:val="top"/>
+            <w:shd w:fill="FFFFFF"/>
             <w:tcMar>
-              <w:top w:w="90" w:type="dxa"/>
-              <w:start w:w="120" w:type="dxa"/>
-              <w:bottom w:w="90" w:type="dxa"/>
-              <w:end w:w="120" w:type="dxa"/>
+              <w:top w:w="70" w:type="dxa"/>
+              <w:start w:w="90" w:type="dxa"/>
+              <w:bottom w:w="70" w:type="dxa"/>
+              <w:end w:w="90" w:type="dxa"/>
             </w:tcMar>
-            <w:vAlign w:val="center"/>
           </w:tcPr>
           <w:p>
             <w:pPr>
-              <w:spacing w:after="0"/>
+              <w:ind w:firstLine="0"/>
+              <w:jc w:val="left"/>
             </w:pPr>
             <w:r>
               <w:rPr>
-                <w:color w:val="071724"/>
-                <w:sz w:val="19"/>
+                <w:rFonts w:ascii="Times New Roman" w:hAnsi="Times New Roman" w:eastAsia="Times New Roman" w:cs="Times New Roman"/>
+                <w:b w:val="0"/>
+                <w:i w:val="0"/>
+                <w:color w:val="000000"/>
+                <w:sz w:val="22"/>
               </w:rPr>
               <w:t>1.0.0</w:t>
             </w:r>
@@ -320,51 +357,59 @@
       <w:tr>
         <w:tc>
           <w:tcPr>
-            <w:tcW w:type="dxa" w:w="1944"/>
-            <w:shd w:fill="E8EEF5"/>
+            <w:tcW w:type="dxa" w:w="2381"/>
+            <w:vAlign w:val="top"/>
+            <w:shd w:fill="FFFFFF"/>
             <w:tcMar>
-              <w:top w:w="90" w:type="dxa"/>
-              <w:start w:w="120" w:type="dxa"/>
-              <w:bottom w:w="90" w:type="dxa"/>
-              <w:end w:w="120" w:type="dxa"/>
+              <w:top w:w="70" w:type="dxa"/>
+              <w:start w:w="90" w:type="dxa"/>
+              <w:bottom w:w="70" w:type="dxa"/>
+              <w:end w:w="90" w:type="dxa"/>
             </w:tcMar>
-            <w:vAlign w:val="center"/>
           </w:tcPr>
           <w:p>
             <w:pPr>
-              <w:spacing w:after="0"/>
+              <w:ind w:firstLine="0"/>
+              <w:jc w:val="left"/>
             </w:pPr>
             <w:r>
               <w:rPr>
+                <w:rFonts w:ascii="Times New Roman" w:hAnsi="Times New Roman" w:eastAsia="Times New Roman" w:cs="Times New Roman"/>
                 <w:b/>
-                <w:color w:val="1F4D78"/>
-                <w:sz w:val="17"/>
+                <w:i w:val="0"/>
+                <w:color w:val="000000"/>
+                <w:sz w:val="22"/>
               </w:rPr>
-              <w:t>SNAPSHOT</w:t>
+              <w:t>Tim pengembang</w:t>
             </w:r>
           </w:p>
         </w:tc>
         <w:tc>
           <w:tcPr>
-            <w:tcW w:type="dxa" w:w="7416"/>
+            <w:tcW w:type="dxa" w:w="6803"/>
+            <w:vAlign w:val="top"/>
+            <w:shd w:fill="FFFFFF"/>
             <w:tcMar>
-              <w:top w:w="90" w:type="dxa"/>
-              <w:start w:w="120" w:type="dxa"/>
-              <w:bottom w:w="90" w:type="dxa"/>
-              <w:end w:w="120" w:type="dxa"/>
+              <w:top w:w="70" w:type="dxa"/>
+              <w:start w:w="90" w:type="dxa"/>
+              <w:bottom w:w="70" w:type="dxa"/>
+              <w:end w:w="90" w:type="dxa"/>
             </w:tcMar>
-            <w:vAlign w:val="center"/>
           </w:tcPr>
           <w:p>
             <w:pPr>
-              <w:spacing w:after="0"/>
+              <w:ind w:firstLine="0"/>
+              <w:jc w:val="left"/>
             </w:pPr>
             <w:r>
               <w:rPr>
-                <w:color w:val="071724"/>
-                <w:sz w:val="19"/>
+                <w:rFonts w:ascii="Times New Roman" w:hAnsi="Times New Roman" w:eastAsia="Times New Roman" w:cs="Times New Roman"/>
+                <w:b w:val="0"/>
+                <w:i w:val="0"/>
+                <w:color w:val="000000"/>
+                <w:sz w:val="22"/>
               </w:rPr>
-              <w:t>13 Agustus 2026</w:t>
+              <w:t>Tim Ajarin Kami Sepuh dari Universitas Diponegoro</w:t>
             </w:r>
           </w:p>
         </w:tc>
@@ -372,112 +417,395 @@
       <w:tr>
         <w:tc>
           <w:tcPr>
-            <w:tcW w:type="dxa" w:w="1944"/>
-            <w:shd w:fill="E8EEF5"/>
+            <w:tcW w:type="dxa" w:w="2381"/>
+            <w:vAlign w:val="top"/>
+            <w:shd w:fill="FFFFFF"/>
             <w:tcMar>
-              <w:top w:w="90" w:type="dxa"/>
-              <w:start w:w="120" w:type="dxa"/>
-              <w:bottom w:w="90" w:type="dxa"/>
-              <w:end w:w="120" w:type="dxa"/>
+              <w:top w:w="70" w:type="dxa"/>
+              <w:start w:w="90" w:type="dxa"/>
+              <w:bottom w:w="70" w:type="dxa"/>
+              <w:end w:w="90" w:type="dxa"/>
             </w:tcMar>
-            <w:vAlign w:val="center"/>
           </w:tcPr>
           <w:p>
             <w:pPr>
-              <w:spacing w:after="0"/>
+              <w:ind w:firstLine="0"/>
+              <w:jc w:val="left"/>
             </w:pPr>
             <w:r>
               <w:rPr>
+                <w:rFonts w:ascii="Times New Roman" w:hAnsi="Times New Roman" w:eastAsia="Times New Roman" w:cs="Times New Roman"/>
                 <w:b/>
-                <w:color w:val="1F4D78"/>
-                <w:sz w:val="17"/>
+                <w:i w:val="0"/>
+                <w:color w:val="000000"/>
+                <w:sz w:val="22"/>
               </w:rPr>
-              <w:t>KLASIFIKASI</w:t>
+              <w:t>Anggota</w:t>
             </w:r>
           </w:p>
         </w:tc>
         <w:tc>
           <w:tcPr>
-            <w:tcW w:type="dxa" w:w="7416"/>
+            <w:tcW w:type="dxa" w:w="6803"/>
+            <w:vAlign w:val="top"/>
+            <w:shd w:fill="FFFFFF"/>
             <w:tcMar>
-              <w:top w:w="90" w:type="dxa"/>
-              <w:start w:w="120" w:type="dxa"/>
-              <w:bottom w:w="90" w:type="dxa"/>
-              <w:end w:w="120" w:type="dxa"/>
+              <w:top w:w="70" w:type="dxa"/>
+              <w:start w:w="90" w:type="dxa"/>
+              <w:bottom w:w="70" w:type="dxa"/>
+              <w:end w:w="90" w:type="dxa"/>
             </w:tcMar>
-            <w:vAlign w:val="center"/>
           </w:tcPr>
           <w:p>
             <w:pPr>
-              <w:spacing w:after="0"/>
+              <w:ind w:firstLine="0"/>
+              <w:jc w:val="left"/>
             </w:pPr>
             <w:r>
               <w:rPr>
-                <w:color w:val="071724"/>
-                <w:sz w:val="19"/>
+                <w:rFonts w:ascii="Times New Roman" w:hAnsi="Times New Roman" w:eastAsia="Times New Roman" w:cs="Times New Roman"/>
+                <w:b w:val="0"/>
+                <w:i w:val="0"/>
+                <w:color w:val="000000"/>
+                <w:sz w:val="22"/>
               </w:rPr>
-              <w:t>Deliverable kompetisi</w:t>
+              <w:t>Muchammad Yuda Tri Ananda; Olivia Oktaviani; Syifa Aeni Mudrikah</w:t>
+            </w:r>
+          </w:p>
+        </w:tc>
+      </w:tr>
+      <w:tr>
+        <w:tc>
+          <w:tcPr>
+            <w:tcW w:type="dxa" w:w="2381"/>
+            <w:vAlign w:val="top"/>
+            <w:shd w:fill="FFFFFF"/>
+            <w:tcMar>
+              <w:top w:w="70" w:type="dxa"/>
+              <w:start w:w="90" w:type="dxa"/>
+              <w:bottom w:w="70" w:type="dxa"/>
+              <w:end w:w="90" w:type="dxa"/>
+            </w:tcMar>
+          </w:tcPr>
+          <w:p>
+            <w:pPr>
+              <w:ind w:firstLine="0"/>
+              <w:jc w:val="left"/>
+            </w:pPr>
+            <w:r>
+              <w:rPr>
+                <w:rFonts w:ascii="Times New Roman" w:hAnsi="Times New Roman" w:eastAsia="Times New Roman" w:cs="Times New Roman"/>
+                <w:b/>
+                <w:i w:val="0"/>
+                <w:color w:val="000000"/>
+                <w:sz w:val="22"/>
+              </w:rPr>
+              <w:t>Perguruan tinggi</w:t>
+            </w:r>
+          </w:p>
+        </w:tc>
+        <w:tc>
+          <w:tcPr>
+            <w:tcW w:type="dxa" w:w="6803"/>
+            <w:vAlign w:val="top"/>
+            <w:shd w:fill="FFFFFF"/>
+            <w:tcMar>
+              <w:top w:w="70" w:type="dxa"/>
+              <w:start w:w="90" w:type="dxa"/>
+              <w:bottom w:w="70" w:type="dxa"/>
+              <w:end w:w="90" w:type="dxa"/>
+            </w:tcMar>
+          </w:tcPr>
+          <w:p>
+            <w:pPr>
+              <w:ind w:firstLine="0"/>
+              <w:jc w:val="left"/>
+            </w:pPr>
+            <w:r>
+              <w:rPr>
+                <w:rFonts w:ascii="Times New Roman" w:hAnsi="Times New Roman" w:eastAsia="Times New Roman" w:cs="Times New Roman"/>
+                <w:b w:val="0"/>
+                <w:i w:val="0"/>
+                <w:color w:val="000000"/>
+                <w:sz w:val="22"/>
+              </w:rPr>
+              <w:t>Universitas Diponegoro</w:t>
+            </w:r>
+          </w:p>
+        </w:tc>
+      </w:tr>
+      <w:tr>
+        <w:tc>
+          <w:tcPr>
+            <w:tcW w:type="dxa" w:w="2381"/>
+            <w:vAlign w:val="top"/>
+            <w:shd w:fill="FFFFFF"/>
+            <w:tcMar>
+              <w:top w:w="70" w:type="dxa"/>
+              <w:start w:w="90" w:type="dxa"/>
+              <w:bottom w:w="70" w:type="dxa"/>
+              <w:end w:w="90" w:type="dxa"/>
+            </w:tcMar>
+          </w:tcPr>
+          <w:p>
+            <w:pPr>
+              <w:ind w:firstLine="0"/>
+              <w:jc w:val="left"/>
+            </w:pPr>
+            <w:r>
+              <w:rPr>
+                <w:rFonts w:ascii="Times New Roman" w:hAnsi="Times New Roman" w:eastAsia="Times New Roman" w:cs="Times New Roman"/>
+                <w:b/>
+                <w:i w:val="0"/>
+                <w:color w:val="000000"/>
+                <w:sz w:val="22"/>
+              </w:rPr>
+              <w:t>Repositori sumber</w:t>
+            </w:r>
+          </w:p>
+        </w:tc>
+        <w:tc>
+          <w:tcPr>
+            <w:tcW w:type="dxa" w:w="6803"/>
+            <w:vAlign w:val="top"/>
+            <w:shd w:fill="FFFFFF"/>
+            <w:tcMar>
+              <w:top w:w="70" w:type="dxa"/>
+              <w:start w:w="90" w:type="dxa"/>
+              <w:bottom w:w="70" w:type="dxa"/>
+              <w:end w:w="90" w:type="dxa"/>
+            </w:tcMar>
+          </w:tcPr>
+          <w:p>
+            <w:pPr>
+              <w:ind w:firstLine="0"/>
+              <w:jc w:val="left"/>
+            </w:pPr>
+            <w:r>
+              <w:rPr>
+                <w:rFonts w:ascii="Times New Roman" w:hAnsi="Times New Roman" w:eastAsia="Times New Roman" w:cs="Times New Roman"/>
+                <w:b w:val="0"/>
+                <w:i w:val="0"/>
+                <w:color w:val="000000"/>
+                <w:sz w:val="22"/>
+              </w:rPr>
+              <w:t>https://github.com/myudak/hawkeye-judolgraph</w:t>
+            </w:r>
+          </w:p>
+        </w:tc>
+      </w:tr>
+      <w:tr>
+        <w:tc>
+          <w:tcPr>
+            <w:tcW w:type="dxa" w:w="2381"/>
+            <w:vAlign w:val="top"/>
+            <w:shd w:fill="FFFFFF"/>
+            <w:tcMar>
+              <w:top w:w="70" w:type="dxa"/>
+              <w:start w:w="90" w:type="dxa"/>
+              <w:bottom w:w="70" w:type="dxa"/>
+              <w:end w:w="90" w:type="dxa"/>
+            </w:tcMar>
+          </w:tcPr>
+          <w:p>
+            <w:pPr>
+              <w:ind w:firstLine="0"/>
+              <w:jc w:val="left"/>
+            </w:pPr>
+            <w:r>
+              <w:rPr>
+                <w:rFonts w:ascii="Times New Roman" w:hAnsi="Times New Roman" w:eastAsia="Times New Roman" w:cs="Times New Roman"/>
+                <w:b/>
+                <w:i w:val="0"/>
+                <w:color w:val="000000"/>
+                <w:sz w:val="22"/>
+              </w:rPr>
+              <w:t>Rilis yang dicakup</w:t>
+            </w:r>
+          </w:p>
+        </w:tc>
+        <w:tc>
+          <w:tcPr>
+            <w:tcW w:type="dxa" w:w="6803"/>
+            <w:vAlign w:val="top"/>
+            <w:shd w:fill="FFFFFF"/>
+            <w:tcMar>
+              <w:top w:w="70" w:type="dxa"/>
+              <w:start w:w="90" w:type="dxa"/>
+              <w:bottom w:w="70" w:type="dxa"/>
+              <w:end w:w="90" w:type="dxa"/>
+            </w:tcMar>
+          </w:tcPr>
+          <w:p>
+            <w:pPr>
+              <w:ind w:firstLine="0"/>
+              <w:jc w:val="left"/>
+            </w:pPr>
+            <w:r>
+              <w:rPr>
+                <w:rFonts w:ascii="Times New Roman" w:hAnsi="Times New Roman" w:eastAsia="Times New Roman" w:cs="Times New Roman"/>
+                <w:b w:val="0"/>
+                <w:i w:val="0"/>
+                <w:color w:val="000000"/>
+                <w:sz w:val="22"/>
+              </w:rPr>
+              <w:t>v1.0.0 — commit 20beb0cd0062fcf986a16c75d07290a7cbb82048</w:t>
+            </w:r>
+          </w:p>
+        </w:tc>
+      </w:tr>
+      <w:tr>
+        <w:tc>
+          <w:tcPr>
+            <w:tcW w:type="dxa" w:w="2381"/>
+            <w:vAlign w:val="top"/>
+            <w:shd w:fill="FFFFFF"/>
+            <w:tcMar>
+              <w:top w:w="70" w:type="dxa"/>
+              <w:start w:w="90" w:type="dxa"/>
+              <w:bottom w:w="70" w:type="dxa"/>
+              <w:end w:w="90" w:type="dxa"/>
+            </w:tcMar>
+          </w:tcPr>
+          <w:p>
+            <w:pPr>
+              <w:ind w:firstLine="0"/>
+              <w:jc w:val="left"/>
+            </w:pPr>
+            <w:r>
+              <w:rPr>
+                <w:rFonts w:ascii="Times New Roman" w:hAnsi="Times New Roman" w:eastAsia="Times New Roman" w:cs="Times New Roman"/>
+                <w:b/>
+                <w:i w:val="0"/>
+                <w:color w:val="000000"/>
+                <w:sz w:val="22"/>
+              </w:rPr>
+              <w:t>Lisensi yang diadopsi</w:t>
+            </w:r>
+          </w:p>
+        </w:tc>
+        <w:tc>
+          <w:tcPr>
+            <w:tcW w:type="dxa" w:w="6803"/>
+            <w:vAlign w:val="top"/>
+            <w:shd w:fill="FFFFFF"/>
+            <w:tcMar>
+              <w:top w:w="70" w:type="dxa"/>
+              <w:start w:w="90" w:type="dxa"/>
+              <w:bottom w:w="70" w:type="dxa"/>
+              <w:end w:w="90" w:type="dxa"/>
+            </w:tcMar>
+          </w:tcPr>
+          <w:p>
+            <w:pPr>
+              <w:ind w:firstLine="0"/>
+              <w:jc w:val="left"/>
+            </w:pPr>
+            <w:r>
+              <w:rPr>
+                <w:rFonts w:ascii="Times New Roman" w:hAnsi="Times New Roman" w:eastAsia="Times New Roman" w:cs="Times New Roman"/>
+                <w:b w:val="0"/>
+                <w:i w:val="0"/>
+                <w:color w:val="000000"/>
+                <w:sz w:val="22"/>
+              </w:rPr>
+              <w:t>MIT License</w:t>
+            </w:r>
+          </w:p>
+        </w:tc>
+      </w:tr>
+      <w:tr>
+        <w:tc>
+          <w:tcPr>
+            <w:tcW w:type="dxa" w:w="2381"/>
+            <w:vAlign w:val="top"/>
+            <w:shd w:fill="FFFFFF"/>
+            <w:tcMar>
+              <w:top w:w="70" w:type="dxa"/>
+              <w:start w:w="90" w:type="dxa"/>
+              <w:bottom w:w="70" w:type="dxa"/>
+              <w:end w:w="90" w:type="dxa"/>
+            </w:tcMar>
+          </w:tcPr>
+          <w:p>
+            <w:pPr>
+              <w:ind w:firstLine="0"/>
+              <w:jc w:val="left"/>
+            </w:pPr>
+            <w:r>
+              <w:rPr>
+                <w:rFonts w:ascii="Times New Roman" w:hAnsi="Times New Roman" w:eastAsia="Times New Roman" w:cs="Times New Roman"/>
+                <w:b/>
+                <w:i w:val="0"/>
+                <w:color w:val="000000"/>
+                <w:sz w:val="22"/>
+              </w:rPr>
+              <w:t>Tanggal berlaku</w:t>
+            </w:r>
+          </w:p>
+        </w:tc>
+        <w:tc>
+          <w:tcPr>
+            <w:tcW w:type="dxa" w:w="6803"/>
+            <w:vAlign w:val="top"/>
+            <w:shd w:fill="FFFFFF"/>
+            <w:tcMar>
+              <w:top w:w="70" w:type="dxa"/>
+              <w:start w:w="90" w:type="dxa"/>
+              <w:bottom w:w="70" w:type="dxa"/>
+              <w:end w:w="90" w:type="dxa"/>
+            </w:tcMar>
+          </w:tcPr>
+          <w:p>
+            <w:pPr>
+              <w:ind w:firstLine="0"/>
+              <w:jc w:val="left"/>
+            </w:pPr>
+            <w:r>
+              <w:rPr>
+                <w:rFonts w:ascii="Times New Roman" w:hAnsi="Times New Roman" w:eastAsia="Times New Roman" w:cs="Times New Roman"/>
+                <w:b w:val="0"/>
+                <w:i w:val="0"/>
+                <w:color w:val="000000"/>
+                <w:sz w:val="22"/>
+              </w:rPr>
+              <w:t>13 Agustus 2026</w:t>
             </w:r>
           </w:p>
         </w:tc>
       </w:tr>
     </w:tbl>
+    <w:p/>
     <w:p>
       <w:pPr>
-        <w:spacing w:after="360"/>
-      </w:pPr>
-    </w:p>
-    <w:p>
-      <w:pPr>
-        <w:spacing w:after="0"/>
-        <w:ind w:left="216" w:right="216"/>
+        <w:pStyle w:val="Heading1"/>
       </w:pPr>
       <w:r>
         <w:rPr>
-          <w:b/>
-          <w:color w:val="667085"/>
-          <w:sz w:val="18"/>
+          <w:rFonts w:ascii="Times New Roman" w:hAnsi="Times New Roman" w:eastAsia="Times New Roman" w:cs="Times New Roman"/>
+          <w:b w:val="0"/>
+          <w:i w:val="0"/>
+          <w:color w:val="000000"/>
+          <w:sz w:val="24"/>
         </w:rPr>
-        <w:t>Batas interpretasi — kandidat adalah lead, kemiripan bukan probabilitas kepemilikan, dan indikator adalah hitungan item bukti.</w:t>
+        <w:t>3. Lisensi yang Diadopsi</w:t>
       </w:r>
     </w:p>
     <w:p>
       <w:pPr>
-        <w:sectPr>
-          <w:pgSz w:w="12240" w:h="15840"/>
-          <w:pgMar w:top="1080" w:right="1123" w:bottom="1037" w:left="1123" w:header="504" w:footer="504" w:gutter="0"/>
-          <w:cols w:space="720"/>
-          <w:docGrid w:linePitch="360"/>
-        </w:sectPr>
+        <w:spacing w:line="360" w:lineRule="auto" w:after="0"/>
+        <w:ind w:firstLine="425"/>
+        <w:jc w:val="both"/>
       </w:pPr>
-    </w:p>
-    <w:p>
       <w:r>
         <w:rPr>
-          <w:b/>
+          <w:rFonts w:ascii="Times New Roman" w:hAnsi="Times New Roman" w:eastAsia="Times New Roman" w:cs="Times New Roman"/>
+          <w:b w:val="0"/>
+          <w:i w:val="0"/>
+          <w:color w:val="000000"/>
+          <w:sz w:val="24"/>
         </w:rPr>
-        <w:t>Produk:</w:t>
-      </w:r>
-      <w:r>
-        <w:t xml:space="preserve"> HAWK-EYE — JudolGraph </w:t>
-      </w:r>
-      <w:r>
-        <w:rPr>
-          <w:b/>
-        </w:rPr>
-        <w:t>Versi:</w:t>
-      </w:r>
-      <w:r>
-        <w:t xml:space="preserve"> 1.0.0 </w:t>
-      </w:r>
-      <w:r>
-        <w:rPr>
-          <w:b/>
-        </w:rPr>
-        <w:t>Tanggal berlaku:</w:t>
-      </w:r>
-      <w:r>
-        <w:t xml:space="preserve"> 13 Agustus 2026</w:t>
+        <w:t>HAWK-EYE versi 1.0.0 mengadopsi MIT License untuk kode sumber, dokumentasi, komponen antarmuka, pengujian, dan materi proyek lain yang merupakan karya asli kontributor HAWK-EYE. Pemberitahuan hak cipta pada lisensi menggunakan istilah “HAWK-EYE contributors”. Dalam versi kompetisi ini, istilah tersebut mencakup anggota Tim Ajarin Kami Sepuh serta kontributor lain atas kontribusi asli yang haknya mereka miliki.</w:t>
       </w:r>
     </w:p>
     <w:p>
@@ -485,70 +813,48 @@
         <w:pStyle w:val="Heading2"/>
       </w:pPr>
       <w:r>
-        <w:t>1. Keputusan lisensi</w:t>
+        <w:rPr>
+          <w:rFonts w:ascii="Times New Roman" w:hAnsi="Times New Roman" w:eastAsia="Times New Roman" w:cs="Times New Roman"/>
+          <w:b w:val="0"/>
+          <w:i w:val="0"/>
+          <w:color w:val="000000"/>
+          <w:sz w:val="24"/>
+        </w:rPr>
+        <w:t>3.1 Alasan Pemilihan MIT License</w:t>
       </w:r>
     </w:p>
     <w:p>
-      <w:r>
-        <w:t xml:space="preserve">Perangkat lunak HAWK-EYE mengadopsi </w:t>
-      </w:r>
+      <w:pPr>
+        <w:spacing w:line="360" w:lineRule="auto" w:after="0"/>
+        <w:ind w:firstLine="425"/>
+        <w:jc w:val="both"/>
+      </w:pPr>
       <w:r>
         <w:rPr>
-          <w:b/>
+          <w:rFonts w:ascii="Times New Roman" w:hAnsi="Times New Roman" w:eastAsia="Times New Roman" w:cs="Times New Roman"/>
+          <w:b w:val="0"/>
+          <w:i w:val="0"/>
+          <w:color w:val="000000"/>
+          <w:sz w:val="24"/>
         </w:rPr>
-        <w:t>MIT License</w:t>
-      </w:r>
-      <w:r>
-        <w:t xml:space="preserve"> untuk kode sumber dan dokumentasi yang dibuat oleh kontributor proyek. Teks lisensi lengkap ditempatkan pada berkas </w:t>
-      </w:r>
-      <w:r>
-        <w:rPr>
-          <w:rFonts w:ascii="Consolas" w:hAnsi="Consolas"/>
-          <w:color w:val="1F4D78"/>
-          <w:sz w:val="19"/>
-        </w:rPr>
-        <w:t>LICENSE</w:t>
-      </w:r>
-      <w:r>
-        <w:t xml:space="preserve"> di akar repositori dan pengenal </w:t>
-      </w:r>
-      <w:r>
-        <w:rPr>
-          <w:rFonts w:ascii="Consolas" w:hAnsi="Consolas"/>
-          <w:color w:val="1F4D78"/>
-          <w:sz w:val="19"/>
-        </w:rPr>
-        <w:t>MIT</w:t>
-      </w:r>
-      <w:r>
-        <w:t xml:space="preserve"> dicantumkan pada </w:t>
-      </w:r>
-      <w:r>
-        <w:rPr>
-          <w:rFonts w:ascii="Consolas" w:hAnsi="Consolas"/>
-          <w:color w:val="1F4D78"/>
-          <w:sz w:val="19"/>
-        </w:rPr>
-        <w:t>package.json</w:t>
-      </w:r>
-      <w:r>
-        <w:t xml:space="preserve"> serta </w:t>
-      </w:r>
-      <w:r>
-        <w:rPr>
-          <w:rFonts w:ascii="Consolas" w:hAnsi="Consolas"/>
-          <w:color w:val="1F4D78"/>
-          <w:sz w:val="19"/>
-        </w:rPr>
-        <w:t>pyproject.toml</w:t>
-      </w:r>
-      <w:r>
-        <w:t>.</w:t>
+        <w:t>MIT License dipilih karena bersifat permisif dan memiliki persyaratan redistribusi yang ringkas. Pengguna dapat mempelajari, menggunakan, memodifikasi, dan mendistribusikan kembali karya asli HAWK-EYE selama pemberitahuan hak cipta dan teks izin dipertahankan. Ketentuan ini mendukung pemeriksaan terbuka terhadap cara sistem mengumpulkan, menyimpan, dan menampilkan bukti.</w:t>
       </w:r>
     </w:p>
     <w:p>
+      <w:pPr>
+        <w:spacing w:line="360" w:lineRule="auto" w:after="0"/>
+        <w:ind w:firstLine="425"/>
+        <w:jc w:val="both"/>
+      </w:pPr>
       <w:r>
-        <w:t>MIT dipilih karena sederhana, permisif, mudah diaudit, dan kompatibel dengan sebagian besar komponen langsung yang digunakan proyek. Lisensi ini mengizinkan penggunaan, penyalinan, perubahan, penggabungan, publikasi, distribusi, sublisensi, dan penjualan salinan, dengan syarat pemberitahuan hak cipta dan teks izin MIT dipertahankan pada salinan atau bagian substansial perangkat lunak. Perangkat lunak disediakan “sebagaimana adanya”, tanpa jaminan.</w:t>
+        <w:rPr>
+          <w:rFonts w:ascii="Times New Roman" w:hAnsi="Times New Roman" w:eastAsia="Times New Roman" w:cs="Times New Roman"/>
+          <w:b w:val="0"/>
+          <w:i w:val="0"/>
+          <w:color w:val="000000"/>
+          <w:sz w:val="24"/>
+        </w:rPr>
+        <w:t>Adopsi MIT tidak melisensikan ulang komponen pihak ketiga. Setiap dependensi tetap menggunakan lisensi upstream sehingga hak dan kewajibannya dapat diperiksa secara terpisah.</w:t>
       </w:r>
     </w:p>
     <w:p>
@@ -556,477 +862,109 @@
         <w:pStyle w:val="Heading2"/>
       </w:pPr>
       <w:r>
-        <w:t>2. Cakupan adopsi</w:t>
-      </w:r>
-    </w:p>
-    <w:p>
-      <w:r>
-        <w:t>Lisensi MIT proyek mencakup karya asli di repositori, antara lain:</w:t>
+        <w:rPr>
+          <w:rFonts w:ascii="Times New Roman" w:hAnsi="Times New Roman" w:eastAsia="Times New Roman" w:cs="Times New Roman"/>
+          <w:b w:val="0"/>
+          <w:i w:val="0"/>
+          <w:color w:val="000000"/>
+          <w:sz w:val="24"/>
+        </w:rPr>
+        <w:t>3.2 Ringkasan Hak dan Kewajiban</w:t>
       </w:r>
     </w:p>
     <w:p>
       <w:pPr>
-        <w:spacing w:after="80" w:line="283" w:lineRule="auto"/>
-        <w:ind w:left="490" w:hanging="288"/>
+        <w:pStyle w:val="Caption"/>
+        <w:keepNext/>
       </w:pPr>
       <w:r>
-        <w:t xml:space="preserve">•  </w:t>
-      </w:r>
-      <w:r>
-        <w:t xml:space="preserve">backend Python pada </w:t>
-      </w:r>
-      <w:r>
         <w:rPr>
-          <w:rFonts w:ascii="Consolas" w:hAnsi="Consolas"/>
-          <w:color w:val="1F4D78"/>
-          <w:sz w:val="19"/>
+          <w:rFonts w:ascii="Times New Roman" w:hAnsi="Times New Roman" w:eastAsia="Times New Roman" w:cs="Times New Roman"/>
+          <w:b w:val="0"/>
+          <w:i/>
+          <w:color w:val="000000"/>
+          <w:sz w:val="22"/>
         </w:rPr>
-        <w:t>apps/api/src/hawkeye</w:t>
-      </w:r>
-      <w:r>
-        <w:t>;</w:t>
-      </w:r>
-    </w:p>
-    <w:p>
-      <w:pPr>
-        <w:spacing w:after="80" w:line="283" w:lineRule="auto"/>
-        <w:ind w:left="490" w:hanging="288"/>
-      </w:pPr>
-      <w:r>
-        <w:t xml:space="preserve">•  </w:t>
-      </w:r>
-      <w:r>
-        <w:t xml:space="preserve">antarmuka React pada </w:t>
-      </w:r>
-      <w:r>
-        <w:rPr>
-          <w:rFonts w:ascii="Consolas" w:hAnsi="Consolas"/>
-          <w:color w:val="1F4D78"/>
-          <w:sz w:val="19"/>
-        </w:rPr>
-        <w:t>apps/web</w:t>
-      </w:r>
-      <w:r>
-        <w:t>;</w:t>
-      </w:r>
-    </w:p>
-    <w:p>
-      <w:pPr>
-        <w:spacing w:after="80" w:line="283" w:lineRule="auto"/>
-        <w:ind w:left="490" w:hanging="288"/>
-      </w:pPr>
-      <w:r>
-        <w:t xml:space="preserve">•  </w:t>
-      </w:r>
-      <w:r>
-        <w:t xml:space="preserve">situs presentasi Astro pada </w:t>
-      </w:r>
-      <w:r>
-        <w:rPr>
-          <w:rFonts w:ascii="Consolas" w:hAnsi="Consolas"/>
-          <w:color w:val="1F4D78"/>
-          <w:sz w:val="19"/>
-        </w:rPr>
-        <w:t>apps/marketing</w:t>
-      </w:r>
-      <w:r>
-        <w:t>;</w:t>
-      </w:r>
-    </w:p>
-    <w:p>
-      <w:pPr>
-        <w:spacing w:after="80" w:line="283" w:lineRule="auto"/>
-        <w:ind w:left="490" w:hanging="288"/>
-      </w:pPr>
-      <w:r>
-        <w:t xml:space="preserve">•  </w:t>
-      </w:r>
-      <w:r>
-        <w:t xml:space="preserve">package internal </w:t>
-      </w:r>
-      <w:r>
-        <w:rPr>
-          <w:rFonts w:ascii="Consolas" w:hAnsi="Consolas"/>
-          <w:color w:val="1F4D78"/>
-          <w:sz w:val="19"/>
-        </w:rPr>
-        <w:t>@hawkeye/brand</w:t>
-      </w:r>
-      <w:r>
-        <w:t xml:space="preserve">, </w:t>
-      </w:r>
-      <w:r>
-        <w:rPr>
-          <w:rFonts w:ascii="Consolas" w:hAnsi="Consolas"/>
-          <w:color w:val="1F4D78"/>
-          <w:sz w:val="19"/>
-        </w:rPr>
-        <w:t>@hawkeye/design</w:t>
-      </w:r>
-      <w:r>
-        <w:t xml:space="preserve">, </w:t>
-      </w:r>
-      <w:r>
-        <w:rPr>
-          <w:rFonts w:ascii="Consolas" w:hAnsi="Consolas"/>
-          <w:color w:val="1F4D78"/>
-          <w:sz w:val="19"/>
-        </w:rPr>
-        <w:t>@hawkeye/graph</w:t>
-      </w:r>
-      <w:r>
-        <w:t>, dan</w:t>
-      </w:r>
-    </w:p>
-    <w:p>
-      <w:r>
-        <w:rPr>
-          <w:rFonts w:ascii="Consolas" w:hAnsi="Consolas"/>
-          <w:color w:val="1F4D78"/>
-          <w:sz w:val="19"/>
-        </w:rPr>
-        <w:t>@hawkeye/ui</w:t>
-      </w:r>
-      <w:r>
-        <w:t>;</w:t>
-      </w:r>
-    </w:p>
-    <w:p>
-      <w:pPr>
-        <w:spacing w:after="80" w:line="283" w:lineRule="auto"/>
-        <w:ind w:left="490" w:hanging="288"/>
-      </w:pPr>
-      <w:r>
-        <w:t xml:space="preserve">•  </w:t>
-      </w:r>
-      <w:r>
-        <w:t>skrip build/evaluasi, pengujian, fixture sintetik, dan dokumentasi proyek</w:t>
-      </w:r>
-    </w:p>
-    <w:p>
-      <w:r>
-        <w:t>sejauh haknya dimiliki kontributor proyek.</w:t>
-      </w:r>
-    </w:p>
-    <w:p>
-      <w:pPr>
-        <w:pStyle w:val="Heading2"/>
-      </w:pPr>
-      <w:r>
-        <w:t>3. Yang tidak dilisensikan ulang sebagai MIT</w:t>
-      </w:r>
-    </w:p>
-    <w:p>
-      <w:r>
-        <w:t xml:space="preserve">Adopsi ini tidak mengubah lisensi library, font, ikon, runtime, browser, tool build, data, logo pihak ketiga, maupun komponen lain yang haknya dimiliki pihak lain. Komponen tersebut tetap tunduk pada lisensi upstream masing-masing. Inventaris dan kewajiban notice dicatat dalam </w:t>
-      </w:r>
-      <w:r>
-        <w:rPr>
-          <w:rFonts w:ascii="Consolas" w:hAnsi="Consolas"/>
-          <w:color w:val="1F4D78"/>
-          <w:sz w:val="19"/>
-        </w:rPr>
-        <w:t>THIRD_PARTY_NOTICES.md</w:t>
-      </w:r>
-      <w:r>
-        <w:t xml:space="preserve"> dan </w:t>
-      </w:r>
-      <w:r>
-        <w:rPr>
-          <w:rFonts w:ascii="Consolas" w:hAnsi="Consolas"/>
-          <w:color w:val="1F4D78"/>
-          <w:sz w:val="19"/>
-        </w:rPr>
-        <w:t>gemastik-2026/LIBRARIES_AND_LICENSES.md</w:t>
-      </w:r>
-      <w:r>
-        <w:t>.</w:t>
-      </w:r>
-    </w:p>
-    <w:p>
-      <w:r>
-        <w:t xml:space="preserve">Materi hasil koleksi web juga bukan karya yang otomatis dilisensikan ulang oleh proyek. Artefak koleksi digunakan sebagai bukti lokal sesuai izin, hukum, dan ketentuan sumber yang berlaku. Paket Gemastik hanya menggunakan fixture </w:t>
-      </w:r>
-      <w:r>
-        <w:rPr>
-          <w:rFonts w:ascii="Consolas" w:hAnsi="Consolas"/>
-          <w:color w:val="1F4D78"/>
-          <w:sz w:val="19"/>
-        </w:rPr>
-        <w:t>.invalid</w:t>
-      </w:r>
-      <w:r>
-        <w:t xml:space="preserve"> yang disanitasi; tidak menyertakan tangkapan situs judi langsung atau data pribadi.</w:t>
-      </w:r>
-    </w:p>
-    <w:p>
-      <w:pPr>
-        <w:pStyle w:val="Heading2"/>
-      </w:pPr>
-      <w:r>
-        <w:t>4. Penerapan dalam distribusi</w:t>
-      </w:r>
-    </w:p>
-    <w:p>
-      <w:r>
-        <w:t>Setiap distribusi source, wheel, container, portable ZIP, atau installer harus:</w:t>
-      </w:r>
-    </w:p>
-    <w:p>
-      <w:pPr>
-        <w:spacing w:after="80" w:line="283" w:lineRule="auto"/>
-        <w:ind w:left="576" w:hanging="403"/>
-      </w:pPr>
-      <w:r>
-        <w:t xml:space="preserve">1.  </w:t>
-      </w:r>
-      <w:r>
-        <w:t xml:space="preserve">menyertakan teks </w:t>
-      </w:r>
-      <w:r>
-        <w:rPr>
-          <w:rFonts w:ascii="Consolas" w:hAnsi="Consolas"/>
-          <w:color w:val="1F4D78"/>
-          <w:sz w:val="19"/>
-        </w:rPr>
-        <w:t>LICENSE</w:t>
-      </w:r>
-      <w:r>
-        <w:t xml:space="preserve"> proyek;</w:t>
-      </w:r>
-    </w:p>
-    <w:p>
-      <w:pPr>
-        <w:spacing w:after="80" w:line="283" w:lineRule="auto"/>
-        <w:ind w:left="576" w:hanging="403"/>
-      </w:pPr>
-      <w:r>
-        <w:t xml:space="preserve">2.  </w:t>
-      </w:r>
-      <w:r>
-        <w:t>mempertahankan pemberitahuan hak cipta dan izin MIT;</w:t>
-      </w:r>
-    </w:p>
-    <w:p>
-      <w:pPr>
-        <w:spacing w:after="80" w:line="283" w:lineRule="auto"/>
-        <w:ind w:left="576" w:hanging="403"/>
-      </w:pPr>
-      <w:r>
-        <w:t xml:space="preserve">3.  </w:t>
-      </w:r>
-      <w:r>
-        <w:t xml:space="preserve">menyertakan </w:t>
-      </w:r>
-      <w:r>
-        <w:rPr>
-          <w:rFonts w:ascii="Consolas" w:hAnsi="Consolas"/>
-          <w:color w:val="1F4D78"/>
-          <w:sz w:val="19"/>
-        </w:rPr>
-        <w:t>THIRD_PARTY_NOTICES.md</w:t>
-      </w:r>
-      <w:r>
-        <w:t xml:space="preserve"> dan teks lisensi/notice upstream yang</w:t>
-      </w:r>
-    </w:p>
-    <w:p>
-      <w:r>
-        <w:t>berlaku pada komponen yang benar-benar didistribusikan;</w:t>
-      </w:r>
-    </w:p>
-    <w:p>
-      <w:pPr>
-        <w:spacing w:after="80" w:line="283" w:lineRule="auto"/>
-        <w:ind w:left="576" w:hanging="403"/>
-      </w:pPr>
-      <w:r>
-        <w:t xml:space="preserve">4.  </w:t>
-      </w:r>
-      <w:r>
-        <w:t>mempertahankan kewajiban OFL, LGPL, MPL, Apache, BSD, CC, PSF, dan lisensi</w:t>
-      </w:r>
-    </w:p>
-    <w:p>
-      <w:r>
-        <w:t>lainnya tanpa menggantinya dengan lisensi MIT proyek;</w:t>
-      </w:r>
-    </w:p>
-    <w:p>
-      <w:pPr>
-        <w:spacing w:after="80" w:line="283" w:lineRule="auto"/>
-        <w:ind w:left="576" w:hanging="403"/>
-      </w:pPr>
-      <w:r>
-        <w:t xml:space="preserve">5.  </w:t>
-      </w:r>
-      <w:r>
-        <w:t>mendokumentasikan perubahan jika distribusi memodifikasi source proyek;</w:t>
-      </w:r>
-    </w:p>
-    <w:p>
-      <w:pPr>
-        <w:spacing w:after="80" w:line="283" w:lineRule="auto"/>
-        <w:ind w:left="576" w:hanging="403"/>
-      </w:pPr>
-      <w:r>
-        <w:t xml:space="preserve">6.  </w:t>
-      </w:r>
-      <w:r>
-        <w:t xml:space="preserve">menjalankan audit ulang ketika </w:t>
-      </w:r>
-      <w:r>
-        <w:rPr>
-          <w:rFonts w:ascii="Consolas" w:hAnsi="Consolas"/>
-          <w:color w:val="1F4D78"/>
-          <w:sz w:val="19"/>
-        </w:rPr>
-        <w:t>uv.lock</w:t>
-      </w:r>
-      <w:r>
-        <w:t xml:space="preserve">, </w:t>
-      </w:r>
-      <w:r>
-        <w:rPr>
-          <w:rFonts w:ascii="Consolas" w:hAnsi="Consolas"/>
-          <w:color w:val="1F4D78"/>
-          <w:sz w:val="19"/>
-        </w:rPr>
-        <w:t>pnpm-lock.yaml</w:t>
-      </w:r>
-      <w:r>
-        <w:t>, browser bundle,</w:t>
-      </w:r>
-    </w:p>
-    <w:p>
-      <w:r>
-        <w:t>font, OCR, atau toolchain pemaketan berubah.</w:t>
-      </w:r>
-    </w:p>
-    <w:p>
-      <w:r>
-        <w:t>Khusus distribusi Windows, pengecualian bootloader PyInstaller dan kewajiban LGPL pystray dipertahankan. Bundle Chromium harus membawa lisensi BSD dan third-party notices yang sesuai. Build tanpa Tesseract tidak boleh mengklaim OCR lokal tersedia; build yang menyertakannya harus membawa notice Apache-2.0.</w:t>
-      </w:r>
-    </w:p>
-    <w:p>
-      <w:pPr>
-        <w:pStyle w:val="Heading2"/>
-      </w:pPr>
-      <w:r>
-        <w:t>5. Hubungan lisensi dengan batas produk</w:t>
-      </w:r>
-    </w:p>
-    <w:p>
-      <w:r>
-        <w:t>Lisensi MIT adalah izin penggunaan karya, bukan jaminan akurasi hasil investigasi dan bukan pembenaran untuk melanggar kontrol akses. HAWK-EYE tetap dibatasi pada koleksi publik, read-only, policy-gated. Kandidat adalah lead yang menunggu review manusia; similarity adalah kemiripan bukti, bukan probabilitas kepemilikan; jumlah indikator adalah hitungan item bukti, bukan vonis legal.</w:t>
-      </w:r>
-    </w:p>
-    <w:p>
-      <w:r>
-        <w:t>Lisensi ini juga tidak memperluas konsol localhost menjadi layanan publik. Autentikasi, otorisasi multi-user, deployment publik, dan threat model produksi memerlukan keputusan terpisah.</w:t>
-      </w:r>
-    </w:p>
-    <w:p>
-      <w:pPr>
-        <w:pStyle w:val="Heading2"/>
-      </w:pPr>
-      <w:r>
-        <w:t>6. Bukti implementasi adopsi</w:t>
+        <w:t>Tabel 1. Ringkasan MIT License yang diadopsi</w:t>
       </w:r>
     </w:p>
     <w:tbl>
       <w:tblPr>
-        <w:tblStyle w:val="TableGrid"/>
         <w:tblW w:type="auto" w:w="0"/>
         <w:jc w:val="center"/>
         <w:tblLayout w:type="fixed"/>
         <w:tblLook w:firstColumn="1" w:firstRow="1" w:lastColumn="0" w:lastRow="0" w:noHBand="0" w:noVBand="1" w:val="04A0"/>
+        <w:tblBorders>
+          <w:top w:val="single" w:sz="4" w:color="808080"/>
+          <w:left w:val="single" w:sz="4" w:color="808080"/>
+          <w:bottom w:val="single" w:sz="4" w:color="808080"/>
+          <w:right w:val="single" w:sz="4" w:color="808080"/>
+          <w:insideH w:val="single" w:sz="4" w:color="808080"/>
+          <w:insideV w:val="single" w:sz="4" w:color="808080"/>
+        </w:tblBorders>
       </w:tblPr>
       <w:tblGrid>
-        <w:gridCol w:w="3331"/>
-        <w:gridCol w:w="3331"/>
-        <w:gridCol w:w="3331"/>
+        <w:gridCol w:w="4536"/>
+        <w:gridCol w:w="4536"/>
       </w:tblGrid>
       <w:tr>
         <w:trPr>
+          <w:tblHeader w:val="true"/>
           <w:cantSplit/>
-          <w:tblHeader w:val="true"/>
         </w:trPr>
         <w:tc>
           <w:tcPr>
-            <w:tcW w:type="dxa" w:w="2520"/>
+            <w:tcW w:type="dxa" w:w="2381"/>
+            <w:vAlign w:val="center"/>
+            <w:shd w:fill="FFFFFF"/>
             <w:tcMar>
-              <w:top w:w="80" w:type="dxa"/>
-              <w:start w:w="120" w:type="dxa"/>
-              <w:bottom w:w="80" w:type="dxa"/>
-              <w:end w:w="120" w:type="dxa"/>
+              <w:top w:w="70" w:type="dxa"/>
+              <w:start w:w="90" w:type="dxa"/>
+              <w:bottom w:w="70" w:type="dxa"/>
+              <w:end w:w="90" w:type="dxa"/>
             </w:tcMar>
-            <w:vAlign w:val="center"/>
-            <w:shd w:fill="E8EEF5"/>
           </w:tcPr>
           <w:p>
             <w:pPr>
-              <w:spacing w:after="0" w:line="252" w:lineRule="auto"/>
+              <w:jc w:val="center"/>
             </w:pPr>
             <w:r>
               <w:rPr>
+                <w:rFonts w:ascii="Times New Roman" w:hAnsi="Times New Roman" w:eastAsia="Times New Roman" w:cs="Times New Roman"/>
                 <w:b/>
-                <w:color w:val="1F4D78"/>
-                <w:sz w:val="17"/>
+                <w:i w:val="0"/>
+                <w:color w:val="000000"/>
+                <w:sz w:val="21"/>
               </w:rPr>
-              <w:t>Kontrol</w:t>
+              <w:t>Aspek</w:t>
             </w:r>
           </w:p>
         </w:tc>
         <w:tc>
           <w:tcPr>
-            <w:tcW w:type="dxa" w:w="1728"/>
+            <w:tcW w:type="dxa" w:w="6973"/>
+            <w:vAlign w:val="center"/>
+            <w:shd w:fill="FFFFFF"/>
             <w:tcMar>
-              <w:top w:w="80" w:type="dxa"/>
-              <w:start w:w="120" w:type="dxa"/>
-              <w:bottom w:w="80" w:type="dxa"/>
-              <w:end w:w="120" w:type="dxa"/>
+              <w:top w:w="70" w:type="dxa"/>
+              <w:start w:w="90" w:type="dxa"/>
+              <w:bottom w:w="70" w:type="dxa"/>
+              <w:end w:w="90" w:type="dxa"/>
             </w:tcMar>
-            <w:vAlign w:val="center"/>
-            <w:shd w:fill="E8EEF5"/>
           </w:tcPr>
           <w:p>
             <w:pPr>
-              <w:spacing w:after="0" w:line="252" w:lineRule="auto"/>
+              <w:jc w:val="center"/>
             </w:pPr>
             <w:r>
               <w:rPr>
+                <w:rFonts w:ascii="Times New Roman" w:hAnsi="Times New Roman" w:eastAsia="Times New Roman" w:cs="Times New Roman"/>
                 <w:b/>
-                <w:color w:val="1F4D78"/>
-                <w:sz w:val="17"/>
+                <w:i w:val="0"/>
+                <w:color w:val="000000"/>
+                <w:sz w:val="21"/>
               </w:rPr>
-              <w:t>Bukti di repositori</w:t>
-            </w:r>
-          </w:p>
-        </w:tc>
-        <w:tc>
-          <w:tcPr>
-            <w:tcW w:type="dxa" w:w="5717"/>
-            <w:tcMar>
-              <w:top w:w="80" w:type="dxa"/>
-              <w:start w:w="120" w:type="dxa"/>
-              <w:bottom w:w="80" w:type="dxa"/>
-              <w:end w:w="120" w:type="dxa"/>
-            </w:tcMar>
-            <w:vAlign w:val="center"/>
-            <w:shd w:fill="E8EEF5"/>
-          </w:tcPr>
-          <w:p>
-            <w:pPr>
-              <w:spacing w:after="0" w:line="252" w:lineRule="auto"/>
-            </w:pPr>
-            <w:r>
-              <w:rPr>
-                <w:b/>
-                <w:color w:val="1F4D78"/>
-                <w:sz w:val="17"/>
-              </w:rPr>
-              <w:t>Status snapshot</w:t>
+              <w:t>Ketentuan</w:t>
             </w:r>
           </w:p>
         </w:tc>
@@ -1037,72 +975,59 @@
         </w:trPr>
         <w:tc>
           <w:tcPr>
-            <w:tcW w:type="dxa" w:w="2520"/>
+            <w:tcW w:type="dxa" w:w="2381"/>
+            <w:vAlign w:val="top"/>
+            <w:shd w:fill="FFFFFF"/>
             <w:tcMar>
-              <w:top w:w="80" w:type="dxa"/>
-              <w:start w:w="120" w:type="dxa"/>
-              <w:bottom w:w="80" w:type="dxa"/>
-              <w:end w:w="120" w:type="dxa"/>
+              <w:top w:w="70" w:type="dxa"/>
+              <w:start w:w="90" w:type="dxa"/>
+              <w:bottom w:w="70" w:type="dxa"/>
+              <w:end w:w="90" w:type="dxa"/>
             </w:tcMar>
-            <w:vAlign w:val="center"/>
           </w:tcPr>
           <w:p>
             <w:pPr>
-              <w:spacing w:after="0" w:line="252" w:lineRule="auto"/>
+              <w:spacing w:line="240" w:lineRule="auto"/>
+              <w:ind w:firstLine="0"/>
             </w:pPr>
             <w:r>
               <w:rPr>
-                <w:sz w:val="17"/>
+                <w:rFonts w:ascii="Times New Roman" w:hAnsi="Times New Roman" w:eastAsia="Times New Roman" w:cs="Times New Roman"/>
+                <w:b w:val="0"/>
+                <w:i w:val="0"/>
+                <w:color w:val="000000"/>
+                <w:sz w:val="21"/>
               </w:rPr>
-              <w:t>Teks lisensi proyek</w:t>
+              <w:t>Hak utama</w:t>
             </w:r>
           </w:p>
         </w:tc>
         <w:tc>
           <w:tcPr>
-            <w:tcW w:type="dxa" w:w="1728"/>
+            <w:tcW w:type="dxa" w:w="6973"/>
+            <w:vAlign w:val="top"/>
+            <w:shd w:fill="FFFFFF"/>
             <w:tcMar>
-              <w:top w:w="80" w:type="dxa"/>
-              <w:start w:w="120" w:type="dxa"/>
-              <w:bottom w:w="80" w:type="dxa"/>
-              <w:end w:w="120" w:type="dxa"/>
+              <w:top w:w="70" w:type="dxa"/>
+              <w:start w:w="90" w:type="dxa"/>
+              <w:bottom w:w="70" w:type="dxa"/>
+              <w:end w:w="90" w:type="dxa"/>
             </w:tcMar>
-            <w:vAlign w:val="center"/>
           </w:tcPr>
           <w:p>
             <w:pPr>
-              <w:spacing w:after="0" w:line="252" w:lineRule="auto"/>
+              <w:spacing w:line="240" w:lineRule="auto"/>
+              <w:ind w:firstLine="0"/>
             </w:pPr>
             <w:r>
               <w:rPr>
-                <w:rFonts w:ascii="Consolas" w:hAnsi="Consolas"/>
-                <w:color w:val="1F4D78"/>
-                <w:sz w:val="17"/>
+                <w:rFonts w:ascii="Times New Roman" w:hAnsi="Times New Roman" w:eastAsia="Times New Roman" w:cs="Times New Roman"/>
+                <w:b w:val="0"/>
+                <w:i w:val="0"/>
+                <w:color w:val="000000"/>
+                <w:sz w:val="21"/>
               </w:rPr>
-              <w:t>LICENSE</w:t>
-            </w:r>
-          </w:p>
-        </w:tc>
-        <w:tc>
-          <w:tcPr>
-            <w:tcW w:type="dxa" w:w="5717"/>
-            <w:tcMar>
-              <w:top w:w="80" w:type="dxa"/>
-              <w:start w:w="120" w:type="dxa"/>
-              <w:bottom w:w="80" w:type="dxa"/>
-              <w:end w:w="120" w:type="dxa"/>
-            </w:tcMar>
-            <w:vAlign w:val="center"/>
-          </w:tcPr>
-          <w:p>
-            <w:pPr>
-              <w:spacing w:after="0" w:line="252" w:lineRule="auto"/>
-            </w:pPr>
-            <w:r>
-              <w:rPr>
-                <w:sz w:val="17"/>
-              </w:rPr>
-              <w:t>Diadopsi</w:t>
+              <w:t>Menggunakan, menyalin, mengubah, menggabungkan, menerbitkan, mendistribusikan, mensublisensikan, dan menjual salinan karya asli HAWK-EYE.</w:t>
             </w:r>
           </w:p>
         </w:tc>
@@ -1113,89 +1038,59 @@
         </w:trPr>
         <w:tc>
           <w:tcPr>
-            <w:tcW w:type="dxa" w:w="2520"/>
+            <w:tcW w:type="dxa" w:w="2381"/>
+            <w:vAlign w:val="top"/>
+            <w:shd w:fill="FFFFFF"/>
             <w:tcMar>
-              <w:top w:w="80" w:type="dxa"/>
-              <w:start w:w="120" w:type="dxa"/>
-              <w:bottom w:w="80" w:type="dxa"/>
-              <w:end w:w="120" w:type="dxa"/>
+              <w:top w:w="70" w:type="dxa"/>
+              <w:start w:w="90" w:type="dxa"/>
+              <w:bottom w:w="70" w:type="dxa"/>
+              <w:end w:w="90" w:type="dxa"/>
             </w:tcMar>
-            <w:vAlign w:val="center"/>
-            <w:shd w:fill="F4F6F9"/>
           </w:tcPr>
           <w:p>
             <w:pPr>
-              <w:spacing w:after="0" w:line="252" w:lineRule="auto"/>
+              <w:spacing w:line="240" w:lineRule="auto"/>
+              <w:ind w:firstLine="0"/>
             </w:pPr>
             <w:r>
               <w:rPr>
-                <w:sz w:val="17"/>
+                <w:rFonts w:ascii="Times New Roman" w:hAnsi="Times New Roman" w:eastAsia="Times New Roman" w:cs="Times New Roman"/>
+                <w:b w:val="0"/>
+                <w:i w:val="0"/>
+                <w:color w:val="000000"/>
+                <w:sz w:val="21"/>
               </w:rPr>
-              <w:t>Metadata JavaScript</w:t>
+              <w:t>Kewajiban utama</w:t>
             </w:r>
           </w:p>
         </w:tc>
         <w:tc>
           <w:tcPr>
-            <w:tcW w:type="dxa" w:w="1728"/>
+            <w:tcW w:type="dxa" w:w="6973"/>
+            <w:vAlign w:val="top"/>
+            <w:shd w:fill="FFFFFF"/>
             <w:tcMar>
-              <w:top w:w="80" w:type="dxa"/>
-              <w:start w:w="120" w:type="dxa"/>
-              <w:bottom w:w="80" w:type="dxa"/>
-              <w:end w:w="120" w:type="dxa"/>
+              <w:top w:w="70" w:type="dxa"/>
+              <w:start w:w="90" w:type="dxa"/>
+              <w:bottom w:w="70" w:type="dxa"/>
+              <w:end w:w="90" w:type="dxa"/>
             </w:tcMar>
-            <w:vAlign w:val="center"/>
-            <w:shd w:fill="F4F6F9"/>
           </w:tcPr>
           <w:p>
             <w:pPr>
-              <w:spacing w:after="0" w:line="252" w:lineRule="auto"/>
+              <w:spacing w:line="240" w:lineRule="auto"/>
+              <w:ind w:firstLine="0"/>
             </w:pPr>
             <w:r>
               <w:rPr>
-                <w:rFonts w:ascii="Consolas" w:hAnsi="Consolas"/>
-                <w:color w:val="1F4D78"/>
-                <w:sz w:val="17"/>
+                <w:rFonts w:ascii="Times New Roman" w:hAnsi="Times New Roman" w:eastAsia="Times New Roman" w:cs="Times New Roman"/>
+                <w:b w:val="0"/>
+                <w:i w:val="0"/>
+                <w:color w:val="000000"/>
+                <w:sz w:val="21"/>
               </w:rPr>
-              <w:t>package.json</w:t>
-            </w:r>
-            <w:r>
-              <w:rPr>
-                <w:sz w:val="17"/>
-              </w:rPr>
-              <w:t xml:space="preserve"> → </w:t>
-            </w:r>
-            <w:r>
-              <w:rPr>
-                <w:rFonts w:ascii="Consolas" w:hAnsi="Consolas"/>
-                <w:color w:val="1F4D78"/>
-                <w:sz w:val="17"/>
-              </w:rPr>
-              <w:t>license: MIT</w:t>
-            </w:r>
-          </w:p>
-        </w:tc>
-        <w:tc>
-          <w:tcPr>
-            <w:tcW w:type="dxa" w:w="5717"/>
-            <w:tcMar>
-              <w:top w:w="80" w:type="dxa"/>
-              <w:start w:w="120" w:type="dxa"/>
-              <w:bottom w:w="80" w:type="dxa"/>
-              <w:end w:w="120" w:type="dxa"/>
-            </w:tcMar>
-            <w:vAlign w:val="center"/>
-            <w:shd w:fill="F4F6F9"/>
-          </w:tcPr>
-          <w:p>
-            <w:pPr>
-              <w:spacing w:after="0" w:line="252" w:lineRule="auto"/>
-            </w:pPr>
-            <w:r>
-              <w:rPr>
-                <w:sz w:val="17"/>
-              </w:rPr>
-              <w:t>Diadopsi</w:t>
+              <w:t>Mempertahankan pemberitahuan hak cipta dan teks izin MIT pada seluruh salinan atau bagian substansial perangkat lunak.</w:t>
             </w:r>
           </w:p>
         </w:tc>
@@ -1206,86 +1101,59 @@
         </w:trPr>
         <w:tc>
           <w:tcPr>
-            <w:tcW w:type="dxa" w:w="2520"/>
+            <w:tcW w:type="dxa" w:w="2381"/>
+            <w:vAlign w:val="top"/>
+            <w:shd w:fill="FFFFFF"/>
             <w:tcMar>
-              <w:top w:w="80" w:type="dxa"/>
-              <w:start w:w="120" w:type="dxa"/>
-              <w:bottom w:w="80" w:type="dxa"/>
-              <w:end w:w="120" w:type="dxa"/>
+              <w:top w:w="70" w:type="dxa"/>
+              <w:start w:w="90" w:type="dxa"/>
+              <w:bottom w:w="70" w:type="dxa"/>
+              <w:end w:w="90" w:type="dxa"/>
             </w:tcMar>
-            <w:vAlign w:val="center"/>
           </w:tcPr>
           <w:p>
             <w:pPr>
-              <w:spacing w:after="0" w:line="252" w:lineRule="auto"/>
+              <w:spacing w:line="240" w:lineRule="auto"/>
+              <w:ind w:firstLine="0"/>
             </w:pPr>
             <w:r>
               <w:rPr>
-                <w:sz w:val="17"/>
+                <w:rFonts w:ascii="Times New Roman" w:hAnsi="Times New Roman" w:eastAsia="Times New Roman" w:cs="Times New Roman"/>
+                <w:b w:val="0"/>
+                <w:i w:val="0"/>
+                <w:color w:val="000000"/>
+                <w:sz w:val="21"/>
               </w:rPr>
-              <w:t>Metadata Python</w:t>
+              <w:t>Jaminan</w:t>
             </w:r>
           </w:p>
         </w:tc>
         <w:tc>
           <w:tcPr>
-            <w:tcW w:type="dxa" w:w="1728"/>
+            <w:tcW w:type="dxa" w:w="6973"/>
+            <w:vAlign w:val="top"/>
+            <w:shd w:fill="FFFFFF"/>
             <w:tcMar>
-              <w:top w:w="80" w:type="dxa"/>
-              <w:start w:w="120" w:type="dxa"/>
-              <w:bottom w:w="80" w:type="dxa"/>
-              <w:end w:w="120" w:type="dxa"/>
+              <w:top w:w="70" w:type="dxa"/>
+              <w:start w:w="90" w:type="dxa"/>
+              <w:bottom w:w="70" w:type="dxa"/>
+              <w:end w:w="90" w:type="dxa"/>
             </w:tcMar>
-            <w:vAlign w:val="center"/>
           </w:tcPr>
           <w:p>
             <w:pPr>
-              <w:spacing w:after="0" w:line="252" w:lineRule="auto"/>
+              <w:spacing w:line="240" w:lineRule="auto"/>
+              <w:ind w:firstLine="0"/>
             </w:pPr>
             <w:r>
               <w:rPr>
-                <w:rFonts w:ascii="Consolas" w:hAnsi="Consolas"/>
-                <w:color w:val="1F4D78"/>
-                <w:sz w:val="17"/>
+                <w:rFonts w:ascii="Times New Roman" w:hAnsi="Times New Roman" w:eastAsia="Times New Roman" w:cs="Times New Roman"/>
+                <w:b w:val="0"/>
+                <w:i w:val="0"/>
+                <w:color w:val="000000"/>
+                <w:sz w:val="21"/>
               </w:rPr>
-              <w:t>pyproject.toml</w:t>
-            </w:r>
-            <w:r>
-              <w:rPr>
-                <w:sz w:val="17"/>
-              </w:rPr>
-              <w:t xml:space="preserve"> → </w:t>
-            </w:r>
-            <w:r>
-              <w:rPr>
-                <w:rFonts w:ascii="Consolas" w:hAnsi="Consolas"/>
-                <w:color w:val="1F4D78"/>
-                <w:sz w:val="17"/>
-              </w:rPr>
-              <w:t>license = "MIT"</w:t>
-            </w:r>
-          </w:p>
-        </w:tc>
-        <w:tc>
-          <w:tcPr>
-            <w:tcW w:type="dxa" w:w="5717"/>
-            <w:tcMar>
-              <w:top w:w="80" w:type="dxa"/>
-              <w:start w:w="120" w:type="dxa"/>
-              <w:bottom w:w="80" w:type="dxa"/>
-              <w:end w:w="120" w:type="dxa"/>
-            </w:tcMar>
-            <w:vAlign w:val="center"/>
-          </w:tcPr>
-          <w:p>
-            <w:pPr>
-              <w:spacing w:after="0" w:line="252" w:lineRule="auto"/>
-            </w:pPr>
-            <w:r>
-              <w:rPr>
-                <w:sz w:val="17"/>
-              </w:rPr>
-              <w:t>Diadopsi</w:t>
+              <w:t>Tidak ada. Perangkat lunak diberikan sebagaimana adanya tanpa jaminan tersurat maupun tersirat.</w:t>
             </w:r>
           </w:p>
         </w:tc>
@@ -1296,75 +1164,351 @@
         </w:trPr>
         <w:tc>
           <w:tcPr>
-            <w:tcW w:type="dxa" w:w="2520"/>
+            <w:tcW w:type="dxa" w:w="2381"/>
+            <w:vAlign w:val="top"/>
+            <w:shd w:fill="FFFFFF"/>
             <w:tcMar>
-              <w:top w:w="80" w:type="dxa"/>
-              <w:start w:w="120" w:type="dxa"/>
-              <w:bottom w:w="80" w:type="dxa"/>
-              <w:end w:w="120" w:type="dxa"/>
+              <w:top w:w="70" w:type="dxa"/>
+              <w:start w:w="90" w:type="dxa"/>
+              <w:bottom w:w="70" w:type="dxa"/>
+              <w:end w:w="90" w:type="dxa"/>
             </w:tcMar>
-            <w:vAlign w:val="center"/>
-            <w:shd w:fill="F4F6F9"/>
           </w:tcPr>
           <w:p>
             <w:pPr>
-              <w:spacing w:after="0" w:line="252" w:lineRule="auto"/>
+              <w:spacing w:line="240" w:lineRule="auto"/>
+              <w:ind w:firstLine="0"/>
             </w:pPr>
             <w:r>
               <w:rPr>
-                <w:sz w:val="17"/>
+                <w:rFonts w:ascii="Times New Roman" w:hAnsi="Times New Roman" w:eastAsia="Times New Roman" w:cs="Times New Roman"/>
+                <w:b w:val="0"/>
+                <w:i w:val="0"/>
+                <w:color w:val="000000"/>
+                <w:sz w:val="21"/>
               </w:rPr>
-              <w:t>Inventaris komponen</w:t>
+              <w:t>Tanggung jawab</w:t>
             </w:r>
           </w:p>
         </w:tc>
         <w:tc>
           <w:tcPr>
-            <w:tcW w:type="dxa" w:w="1728"/>
+            <w:tcW w:type="dxa" w:w="6973"/>
+            <w:vAlign w:val="top"/>
+            <w:shd w:fill="FFFFFF"/>
             <w:tcMar>
-              <w:top w:w="80" w:type="dxa"/>
-              <w:start w:w="120" w:type="dxa"/>
-              <w:bottom w:w="80" w:type="dxa"/>
-              <w:end w:w="120" w:type="dxa"/>
+              <w:top w:w="70" w:type="dxa"/>
+              <w:start w:w="90" w:type="dxa"/>
+              <w:bottom w:w="70" w:type="dxa"/>
+              <w:end w:w="90" w:type="dxa"/>
             </w:tcMar>
-            <w:vAlign w:val="center"/>
-            <w:shd w:fill="F4F6F9"/>
           </w:tcPr>
           <w:p>
             <w:pPr>
-              <w:spacing w:after="0" w:line="252" w:lineRule="auto"/>
+              <w:spacing w:line="240" w:lineRule="auto"/>
+              <w:ind w:firstLine="0"/>
             </w:pPr>
             <w:r>
               <w:rPr>
-                <w:rFonts w:ascii="Consolas" w:hAnsi="Consolas"/>
-                <w:color w:val="1F4D78"/>
-                <w:sz w:val="17"/>
+                <w:rFonts w:ascii="Times New Roman" w:hAnsi="Times New Roman" w:eastAsia="Times New Roman" w:cs="Times New Roman"/>
+                <w:b w:val="0"/>
+                <w:i w:val="0"/>
+                <w:color w:val="000000"/>
+                <w:sz w:val="21"/>
               </w:rPr>
-              <w:t>gemastik-2026/LIBRARIES_AND_LICENSES.md</w:t>
+              <w:t>Pemegang hak cipta tidak bertanggung jawab atas klaim atau kerugian yang timbul dari penggunaan perangkat lunak sejauh dinyatakan dalam teks lisensi.</w:t>
+            </w:r>
+          </w:p>
+        </w:tc>
+      </w:tr>
+    </w:tbl>
+    <w:p>
+      <w:pPr>
+        <w:pStyle w:val="Heading1"/>
+      </w:pPr>
+      <w:r>
+        <w:rPr>
+          <w:rFonts w:ascii="Times New Roman" w:hAnsi="Times New Roman" w:eastAsia="Times New Roman" w:cs="Times New Roman"/>
+          <w:b w:val="0"/>
+          <w:i w:val="0"/>
+          <w:color w:val="000000"/>
+          <w:sz w:val="24"/>
+        </w:rPr>
+        <w:t>4. Cakupan Karya Asli</w:t>
+      </w:r>
+    </w:p>
+    <w:p>
+      <w:pPr>
+        <w:spacing w:line="360" w:lineRule="auto" w:after="0"/>
+        <w:ind w:firstLine="425"/>
+        <w:jc w:val="both"/>
+      </w:pPr>
+      <w:r>
+        <w:rPr>
+          <w:rFonts w:ascii="Times New Roman" w:hAnsi="Times New Roman" w:eastAsia="Times New Roman" w:cs="Times New Roman"/>
+          <w:b w:val="0"/>
+          <w:i w:val="0"/>
+          <w:color w:val="000000"/>
+          <w:sz w:val="24"/>
+        </w:rPr>
+        <w:t>Lisensi MIT mencakup bagian yang haknya dimiliki kontributor HAWK-EYE, yaitu:</w:t>
+      </w:r>
+    </w:p>
+    <w:p>
+      <w:pPr>
+        <w:spacing w:line="360" w:lineRule="auto"/>
+        <w:ind w:left="425" w:hanging="255"/>
+      </w:pPr>
+      <w:r>
+        <w:rPr>
+          <w:rFonts w:ascii="Times New Roman" w:hAnsi="Times New Roman" w:eastAsia="Times New Roman" w:cs="Times New Roman"/>
+          <w:b w:val="0"/>
+          <w:i w:val="0"/>
+          <w:color w:val="000000"/>
+          <w:sz w:val="24"/>
+        </w:rPr>
+        <w:t xml:space="preserve">• </w:t>
+      </w:r>
+      <w:r>
+        <w:rPr>
+          <w:rFonts w:ascii="Times New Roman" w:hAnsi="Times New Roman" w:eastAsia="Times New Roman" w:cs="Times New Roman"/>
+          <w:b w:val="0"/>
+          <w:i w:val="0"/>
+          <w:color w:val="000000"/>
+          <w:sz w:val="24"/>
+        </w:rPr>
+        <w:t>backend Python untuk collector, ekstraksi, model runtime terbatas, penyimpanan, API lokal, dan ekspor kasus;</w:t>
+      </w:r>
+    </w:p>
+    <w:p>
+      <w:pPr>
+        <w:spacing w:line="360" w:lineRule="auto"/>
+        <w:ind w:left="425" w:hanging="255"/>
+      </w:pPr>
+      <w:r>
+        <w:rPr>
+          <w:rFonts w:ascii="Times New Roman" w:hAnsi="Times New Roman" w:eastAsia="Times New Roman" w:cs="Times New Roman"/>
+          <w:b w:val="0"/>
+          <w:i w:val="0"/>
+          <w:color w:val="000000"/>
+          <w:sz w:val="24"/>
+        </w:rPr>
+        <w:t xml:space="preserve">• </w:t>
+      </w:r>
+      <w:r>
+        <w:rPr>
+          <w:rFonts w:ascii="Times New Roman" w:hAnsi="Times New Roman" w:eastAsia="Times New Roman" w:cs="Times New Roman"/>
+          <w:b w:val="0"/>
+          <w:i w:val="0"/>
+          <w:color w:val="000000"/>
+          <w:sz w:val="24"/>
+        </w:rPr>
+        <w:t>aplikasi web React untuk pengelolaan kasus, evidence graph, inspector bukti, timeline, review, dan ringkasan;</w:t>
+      </w:r>
+    </w:p>
+    <w:p>
+      <w:pPr>
+        <w:spacing w:line="360" w:lineRule="auto"/>
+        <w:ind w:left="425" w:hanging="255"/>
+      </w:pPr>
+      <w:r>
+        <w:rPr>
+          <w:rFonts w:ascii="Times New Roman" w:hAnsi="Times New Roman" w:eastAsia="Times New Roman" w:cs="Times New Roman"/>
+          <w:b w:val="0"/>
+          <w:i w:val="0"/>
+          <w:color w:val="000000"/>
+          <w:sz w:val="24"/>
+        </w:rPr>
+        <w:t xml:space="preserve">• </w:t>
+      </w:r>
+      <w:r>
+        <w:rPr>
+          <w:rFonts w:ascii="Times New Roman" w:hAnsi="Times New Roman" w:eastAsia="Times New Roman" w:cs="Times New Roman"/>
+          <w:b w:val="0"/>
+          <w:i w:val="0"/>
+          <w:color w:val="000000"/>
+          <w:sz w:val="24"/>
+        </w:rPr>
+        <w:t>situs presentasi Astro dan demonstrasi dengan data terkendali;</w:t>
+      </w:r>
+    </w:p>
+    <w:p>
+      <w:pPr>
+        <w:spacing w:line="360" w:lineRule="auto"/>
+        <w:ind w:left="425" w:hanging="255"/>
+      </w:pPr>
+      <w:r>
+        <w:rPr>
+          <w:rFonts w:ascii="Times New Roman" w:hAnsi="Times New Roman" w:eastAsia="Times New Roman" w:cs="Times New Roman"/>
+          <w:b w:val="0"/>
+          <w:i w:val="0"/>
+          <w:color w:val="000000"/>
+          <w:sz w:val="24"/>
+        </w:rPr>
+        <w:t xml:space="preserve">• </w:t>
+      </w:r>
+      <w:r>
+        <w:rPr>
+          <w:rFonts w:ascii="Times New Roman" w:hAnsi="Times New Roman" w:eastAsia="Times New Roman" w:cs="Times New Roman"/>
+          <w:b w:val="0"/>
+          <w:i w:val="0"/>
+          <w:color w:val="000000"/>
+          <w:sz w:val="24"/>
+        </w:rPr>
+        <w:t>package internal untuk brand, desain, graph, dan komponen antarmuka bersama;</w:t>
+      </w:r>
+    </w:p>
+    <w:p>
+      <w:pPr>
+        <w:spacing w:line="360" w:lineRule="auto"/>
+        <w:ind w:left="425" w:hanging="255"/>
+      </w:pPr>
+      <w:r>
+        <w:rPr>
+          <w:rFonts w:ascii="Times New Roman" w:hAnsi="Times New Roman" w:eastAsia="Times New Roman" w:cs="Times New Roman"/>
+          <w:b w:val="0"/>
+          <w:i w:val="0"/>
+          <w:color w:val="000000"/>
+          <w:sz w:val="24"/>
+        </w:rPr>
+        <w:t xml:space="preserve">• </w:t>
+      </w:r>
+      <w:r>
+        <w:rPr>
+          <w:rFonts w:ascii="Times New Roman" w:hAnsi="Times New Roman" w:eastAsia="Times New Roman" w:cs="Times New Roman"/>
+          <w:b w:val="0"/>
+          <w:i w:val="0"/>
+          <w:color w:val="000000"/>
+          <w:sz w:val="24"/>
+        </w:rPr>
+        <w:t>skrip build, evaluasi, pengujian, fixture sintetik, serta dokumentasi yang dibuat oleh tim.</w:t>
+      </w:r>
+    </w:p>
+    <w:p>
+      <w:pPr>
+        <w:pStyle w:val="Heading1"/>
+      </w:pPr>
+      <w:r>
+        <w:rPr>
+          <w:rFonts w:ascii="Times New Roman" w:hAnsi="Times New Roman" w:eastAsia="Times New Roman" w:cs="Times New Roman"/>
+          <w:b w:val="0"/>
+          <w:i w:val="0"/>
+          <w:color w:val="000000"/>
+          <w:sz w:val="24"/>
+        </w:rPr>
+        <w:t>5. Komponen Pihak Ketiga</w:t>
+      </w:r>
+    </w:p>
+    <w:p>
+      <w:pPr>
+        <w:spacing w:line="360" w:lineRule="auto" w:after="0"/>
+        <w:ind w:firstLine="425"/>
+        <w:jc w:val="both"/>
+      </w:pPr>
+      <w:r>
+        <w:rPr>
+          <w:rFonts w:ascii="Times New Roman" w:hAnsi="Times New Roman" w:eastAsia="Times New Roman" w:cs="Times New Roman"/>
+          <w:b w:val="0"/>
+          <w:i w:val="0"/>
+          <w:color w:val="000000"/>
+          <w:sz w:val="24"/>
+        </w:rPr>
+        <w:t>MIT License HAWK-EYE tidak mengubah lisensi library, font, ikon, runtime, browser, tool build, data, logo, atau materi lain yang haknya dimiliki pihak ketiga. Setiap komponen tetap tunduk pada ketentuan upstream masing-masing.</w:t>
+      </w:r>
+    </w:p>
+    <w:p>
+      <w:pPr>
+        <w:pStyle w:val="Caption"/>
+        <w:keepNext/>
+      </w:pPr>
+      <w:r>
+        <w:rPr>
+          <w:rFonts w:ascii="Times New Roman" w:hAnsi="Times New Roman" w:eastAsia="Times New Roman" w:cs="Times New Roman"/>
+          <w:b w:val="0"/>
+          <w:i/>
+          <w:color w:val="000000"/>
+          <w:sz w:val="22"/>
+        </w:rPr>
+        <w:t>Tabel 2. Kelompok komponen pihak ketiga dan perlakuan lisensinya</w:t>
+      </w:r>
+    </w:p>
+    <w:tbl>
+      <w:tblPr>
+        <w:tblW w:type="auto" w:w="0"/>
+        <w:jc w:val="center"/>
+        <w:tblLayout w:type="fixed"/>
+        <w:tblLook w:firstColumn="1" w:firstRow="1" w:lastColumn="0" w:lastRow="0" w:noHBand="0" w:noVBand="1" w:val="04A0"/>
+        <w:tblBorders>
+          <w:top w:val="single" w:sz="4" w:color="808080"/>
+          <w:left w:val="single" w:sz="4" w:color="808080"/>
+          <w:bottom w:val="single" w:sz="4" w:color="808080"/>
+          <w:right w:val="single" w:sz="4" w:color="808080"/>
+          <w:insideH w:val="single" w:sz="4" w:color="808080"/>
+          <w:insideV w:val="single" w:sz="4" w:color="808080"/>
+        </w:tblBorders>
+      </w:tblPr>
+      <w:tblGrid>
+        <w:gridCol w:w="4536"/>
+        <w:gridCol w:w="4536"/>
+      </w:tblGrid>
+      <w:tr>
+        <w:trPr>
+          <w:tblHeader w:val="true"/>
+          <w:cantSplit/>
+        </w:trPr>
+        <w:tc>
+          <w:tcPr>
+            <w:tcW w:type="dxa" w:w="2608"/>
+            <w:vAlign w:val="center"/>
+            <w:shd w:fill="FFFFFF"/>
+            <w:tcMar>
+              <w:top w:w="70" w:type="dxa"/>
+              <w:start w:w="90" w:type="dxa"/>
+              <w:bottom w:w="70" w:type="dxa"/>
+              <w:end w:w="90" w:type="dxa"/>
+            </w:tcMar>
+          </w:tcPr>
+          <w:p>
+            <w:pPr>
+              <w:jc w:val="center"/>
+            </w:pPr>
+            <w:r>
+              <w:rPr>
+                <w:rFonts w:ascii="Times New Roman" w:hAnsi="Times New Roman" w:eastAsia="Times New Roman" w:cs="Times New Roman"/>
+                <w:b/>
+                <w:i w:val="0"/>
+                <w:color w:val="000000"/>
+                <w:sz w:val="21"/>
+              </w:rPr>
+              <w:t>Kelompok</w:t>
             </w:r>
           </w:p>
         </w:tc>
         <w:tc>
           <w:tcPr>
-            <w:tcW w:type="dxa" w:w="5717"/>
+            <w:tcW w:type="dxa" w:w="6746"/>
+            <w:vAlign w:val="center"/>
+            <w:shd w:fill="FFFFFF"/>
             <w:tcMar>
-              <w:top w:w="80" w:type="dxa"/>
-              <w:start w:w="120" w:type="dxa"/>
-              <w:bottom w:w="80" w:type="dxa"/>
-              <w:end w:w="120" w:type="dxa"/>
+              <w:top w:w="70" w:type="dxa"/>
+              <w:start w:w="90" w:type="dxa"/>
+              <w:bottom w:w="70" w:type="dxa"/>
+              <w:end w:w="90" w:type="dxa"/>
             </w:tcMar>
-            <w:vAlign w:val="center"/>
-            <w:shd w:fill="F4F6F9"/>
           </w:tcPr>
           <w:p>
             <w:pPr>
-              <w:spacing w:after="0" w:line="252" w:lineRule="auto"/>
+              <w:jc w:val="center"/>
             </w:pPr>
             <w:r>
               <w:rPr>
-                <w:sz w:val="17"/>
+                <w:rFonts w:ascii="Times New Roman" w:hAnsi="Times New Roman" w:eastAsia="Times New Roman" w:cs="Times New Roman"/>
+                <w:b/>
+                <w:i w:val="0"/>
+                <w:color w:val="000000"/>
+                <w:sz w:val="21"/>
               </w:rPr>
-              <w:t>Selesai</w:t>
+              <w:t>Ketentuan</w:t>
             </w:r>
           </w:p>
         </w:tc>
@@ -1375,72 +1519,59 @@
         </w:trPr>
         <w:tc>
           <w:tcPr>
-            <w:tcW w:type="dxa" w:w="2520"/>
+            <w:tcW w:type="dxa" w:w="2608"/>
+            <w:vAlign w:val="top"/>
+            <w:shd w:fill="FFFFFF"/>
             <w:tcMar>
-              <w:top w:w="80" w:type="dxa"/>
-              <w:start w:w="120" w:type="dxa"/>
-              <w:bottom w:w="80" w:type="dxa"/>
-              <w:end w:w="120" w:type="dxa"/>
+              <w:top w:w="70" w:type="dxa"/>
+              <w:start w:w="90" w:type="dxa"/>
+              <w:bottom w:w="70" w:type="dxa"/>
+              <w:end w:w="90" w:type="dxa"/>
             </w:tcMar>
-            <w:vAlign w:val="center"/>
           </w:tcPr>
           <w:p>
             <w:pPr>
-              <w:spacing w:after="0" w:line="252" w:lineRule="auto"/>
+              <w:spacing w:line="240" w:lineRule="auto"/>
+              <w:ind w:firstLine="0"/>
             </w:pPr>
             <w:r>
               <w:rPr>
-                <w:sz w:val="17"/>
+                <w:rFonts w:ascii="Times New Roman" w:hAnsi="Times New Roman" w:eastAsia="Times New Roman" w:cs="Times New Roman"/>
+                <w:b w:val="0"/>
+                <w:i w:val="0"/>
+                <w:color w:val="000000"/>
+                <w:sz w:val="21"/>
               </w:rPr>
-              <w:t>Notice pihak ketiga</w:t>
+              <w:t>Library dan framework</w:t>
             </w:r>
           </w:p>
         </w:tc>
         <w:tc>
           <w:tcPr>
-            <w:tcW w:type="dxa" w:w="1728"/>
+            <w:tcW w:type="dxa" w:w="6746"/>
+            <w:vAlign w:val="top"/>
+            <w:shd w:fill="FFFFFF"/>
             <w:tcMar>
-              <w:top w:w="80" w:type="dxa"/>
-              <w:start w:w="120" w:type="dxa"/>
-              <w:bottom w:w="80" w:type="dxa"/>
-              <w:end w:w="120" w:type="dxa"/>
+              <w:top w:w="70" w:type="dxa"/>
+              <w:start w:w="90" w:type="dxa"/>
+              <w:bottom w:w="70" w:type="dxa"/>
+              <w:end w:w="90" w:type="dxa"/>
             </w:tcMar>
-            <w:vAlign w:val="center"/>
           </w:tcPr>
           <w:p>
             <w:pPr>
-              <w:spacing w:after="0" w:line="252" w:lineRule="auto"/>
+              <w:spacing w:line="240" w:lineRule="auto"/>
+              <w:ind w:firstLine="0"/>
             </w:pPr>
             <w:r>
               <w:rPr>
-                <w:rFonts w:ascii="Consolas" w:hAnsi="Consolas"/>
-                <w:color w:val="1F4D78"/>
-                <w:sz w:val="17"/>
+                <w:rFonts w:ascii="Times New Roman" w:hAnsi="Times New Roman" w:eastAsia="Times New Roman" w:cs="Times New Roman"/>
+                <w:b w:val="0"/>
+                <w:i w:val="0"/>
+                <w:color w:val="000000"/>
+                <w:sz w:val="21"/>
               </w:rPr>
-              <w:t>THIRD_PARTY_NOTICES.md</w:t>
-            </w:r>
-          </w:p>
-        </w:tc>
-        <w:tc>
-          <w:tcPr>
-            <w:tcW w:type="dxa" w:w="5717"/>
-            <w:tcMar>
-              <w:top w:w="80" w:type="dxa"/>
-              <w:start w:w="120" w:type="dxa"/>
-              <w:bottom w:w="80" w:type="dxa"/>
-              <w:end w:w="120" w:type="dxa"/>
-            </w:tcMar>
-            <w:vAlign w:val="center"/>
-          </w:tcPr>
-          <w:p>
-            <w:pPr>
-              <w:spacing w:after="0" w:line="252" w:lineRule="auto"/>
-            </w:pPr>
-            <w:r>
-              <w:rPr>
-                <w:sz w:val="17"/>
-              </w:rPr>
-              <w:t>Selesai untuk lock snapshot</w:t>
+              <w:t>FastAPI, Playwright, React, Astro, Tailwind CSS, Base UI, dan dependensi lain tetap menggunakan lisensi MIT, Apache, BSD, atau lisensi upstream masing-masing.</w:t>
             </w:r>
           </w:p>
         </w:tc>
@@ -1451,81 +1582,311 @@
         </w:trPr>
         <w:tc>
           <w:tcPr>
-            <w:tcW w:type="dxa" w:w="2520"/>
+            <w:tcW w:type="dxa" w:w="2608"/>
+            <w:vAlign w:val="top"/>
+            <w:shd w:fill="FFFFFF"/>
             <w:tcMar>
-              <w:top w:w="80" w:type="dxa"/>
-              <w:start w:w="120" w:type="dxa"/>
-              <w:bottom w:w="80" w:type="dxa"/>
-              <w:end w:w="120" w:type="dxa"/>
+              <w:top w:w="70" w:type="dxa"/>
+              <w:start w:w="90" w:type="dxa"/>
+              <w:bottom w:w="70" w:type="dxa"/>
+              <w:end w:w="90" w:type="dxa"/>
             </w:tcMar>
-            <w:vAlign w:val="center"/>
-            <w:shd w:fill="F4F6F9"/>
           </w:tcPr>
           <w:p>
             <w:pPr>
-              <w:spacing w:after="0" w:line="252" w:lineRule="auto"/>
+              <w:spacing w:line="240" w:lineRule="auto"/>
+              <w:ind w:firstLine="0"/>
             </w:pPr>
             <w:r>
               <w:rPr>
-                <w:sz w:val="17"/>
+                <w:rFonts w:ascii="Times New Roman" w:hAnsi="Times New Roman" w:eastAsia="Times New Roman" w:cs="Times New Roman"/>
+                <w:b w:val="0"/>
+                <w:i w:val="0"/>
+                <w:color w:val="000000"/>
+                <w:sz w:val="21"/>
               </w:rPr>
-              <w:t>Rekam keputusan</w:t>
+              <w:t>Font dan ikon</w:t>
             </w:r>
           </w:p>
         </w:tc>
         <w:tc>
           <w:tcPr>
-            <w:tcW w:type="dxa" w:w="1728"/>
+            <w:tcW w:type="dxa" w:w="6746"/>
+            <w:vAlign w:val="top"/>
+            <w:shd w:fill="FFFFFF"/>
             <w:tcMar>
-              <w:top w:w="80" w:type="dxa"/>
-              <w:start w:w="120" w:type="dxa"/>
-              <w:bottom w:w="80" w:type="dxa"/>
-              <w:end w:w="120" w:type="dxa"/>
+              <w:top w:w="70" w:type="dxa"/>
+              <w:start w:w="90" w:type="dxa"/>
+              <w:bottom w:w="70" w:type="dxa"/>
+              <w:end w:w="90" w:type="dxa"/>
             </w:tcMar>
-            <w:vAlign w:val="center"/>
-            <w:shd w:fill="F4F6F9"/>
           </w:tcPr>
           <w:p>
             <w:pPr>
-              <w:spacing w:after="0" w:line="252" w:lineRule="auto"/>
+              <w:spacing w:line="240" w:lineRule="auto"/>
+              <w:ind w:firstLine="0"/>
             </w:pPr>
             <w:r>
               <w:rPr>
-                <w:rFonts w:ascii="Consolas" w:hAnsi="Consolas"/>
-                <w:color w:val="1F4D78"/>
-                <w:sz w:val="17"/>
+                <w:rFonts w:ascii="Times New Roman" w:hAnsi="Times New Roman" w:eastAsia="Times New Roman" w:cs="Times New Roman"/>
+                <w:b w:val="0"/>
+                <w:i w:val="0"/>
+                <w:color w:val="000000"/>
+                <w:sz w:val="21"/>
               </w:rPr>
-              <w:t>docs/DECISIONS.md</w:t>
+              <w:t>Fontsource menggunakan OFL-1.1; ikon dan aset eksternal tetap menggunakan lisensi sumbernya. Nama dan merek yang dilindungi tidak dialihkan kepada proyek.</w:t>
             </w:r>
+          </w:p>
+        </w:tc>
+      </w:tr>
+      <w:tr>
+        <w:trPr>
+          <w:cantSplit/>
+        </w:trPr>
+        <w:tc>
+          <w:tcPr>
+            <w:tcW w:type="dxa" w:w="2608"/>
+            <w:vAlign w:val="top"/>
+            <w:shd w:fill="FFFFFF"/>
+            <w:tcMar>
+              <w:top w:w="70" w:type="dxa"/>
+              <w:start w:w="90" w:type="dxa"/>
+              <w:bottom w:w="70" w:type="dxa"/>
+              <w:end w:w="90" w:type="dxa"/>
+            </w:tcMar>
+          </w:tcPr>
+          <w:p>
+            <w:pPr>
+              <w:spacing w:line="240" w:lineRule="auto"/>
+              <w:ind w:firstLine="0"/>
+            </w:pPr>
             <w:r>
               <w:rPr>
-                <w:sz w:val="17"/>
+                <w:rFonts w:ascii="Times New Roman" w:hAnsi="Times New Roman" w:eastAsia="Times New Roman" w:cs="Times New Roman"/>
+                <w:b w:val="0"/>
+                <w:i w:val="0"/>
+                <w:color w:val="000000"/>
+                <w:sz w:val="21"/>
               </w:rPr>
-              <w:t>, ADR-038</w:t>
+              <w:t>Browser dan runtime</w:t>
             </w:r>
           </w:p>
         </w:tc>
         <w:tc>
           <w:tcPr>
-            <w:tcW w:type="dxa" w:w="5717"/>
+            <w:tcW w:type="dxa" w:w="6746"/>
+            <w:vAlign w:val="top"/>
+            <w:shd w:fill="FFFFFF"/>
             <w:tcMar>
-              <w:top w:w="80" w:type="dxa"/>
-              <w:start w:w="120" w:type="dxa"/>
-              <w:bottom w:w="80" w:type="dxa"/>
-              <w:end w:w="120" w:type="dxa"/>
+              <w:top w:w="70" w:type="dxa"/>
+              <w:start w:w="90" w:type="dxa"/>
+              <w:bottom w:w="70" w:type="dxa"/>
+              <w:end w:w="90" w:type="dxa"/>
             </w:tcMar>
-            <w:vAlign w:val="center"/>
-            <w:shd w:fill="F4F6F9"/>
           </w:tcPr>
           <w:p>
             <w:pPr>
-              <w:spacing w:after="0" w:line="252" w:lineRule="auto"/>
+              <w:spacing w:line="240" w:lineRule="auto"/>
+              <w:ind w:firstLine="0"/>
             </w:pPr>
             <w:r>
               <w:rPr>
-                <w:sz w:val="17"/>
+                <w:rFonts w:ascii="Times New Roman" w:hAnsi="Times New Roman" w:eastAsia="Times New Roman" w:cs="Times New Roman"/>
+                <w:b w:val="0"/>
+                <w:i w:val="0"/>
+                <w:color w:val="000000"/>
+                <w:sz w:val="21"/>
               </w:rPr>
-              <w:t>Selesai</w:t>
+              <w:t>Chromium membawa BSD-3-Clause dan banyak third-party notices; Python membawa PSF License; SQLite berada pada public domain.</w:t>
+            </w:r>
+          </w:p>
+        </w:tc>
+      </w:tr>
+      <w:tr>
+        <w:trPr>
+          <w:cantSplit/>
+        </w:trPr>
+        <w:tc>
+          <w:tcPr>
+            <w:tcW w:type="dxa" w:w="2608"/>
+            <w:vAlign w:val="top"/>
+            <w:shd w:fill="FFFFFF"/>
+            <w:tcMar>
+              <w:top w:w="70" w:type="dxa"/>
+              <w:start w:w="90" w:type="dxa"/>
+              <w:bottom w:w="70" w:type="dxa"/>
+              <w:end w:w="90" w:type="dxa"/>
+            </w:tcMar>
+          </w:tcPr>
+          <w:p>
+            <w:pPr>
+              <w:spacing w:line="240" w:lineRule="auto"/>
+              <w:ind w:firstLine="0"/>
+            </w:pPr>
+            <w:r>
+              <w:rPr>
+                <w:rFonts w:ascii="Times New Roman" w:hAnsi="Times New Roman" w:eastAsia="Times New Roman" w:cs="Times New Roman"/>
+                <w:b w:val="0"/>
+                <w:i w:val="0"/>
+                <w:color w:val="000000"/>
+                <w:sz w:val="21"/>
+              </w:rPr>
+              <w:t>Toolchain Windows</w:t>
+            </w:r>
+          </w:p>
+        </w:tc>
+        <w:tc>
+          <w:tcPr>
+            <w:tcW w:type="dxa" w:w="6746"/>
+            <w:vAlign w:val="top"/>
+            <w:shd w:fill="FFFFFF"/>
+            <w:tcMar>
+              <w:top w:w="70" w:type="dxa"/>
+              <w:start w:w="90" w:type="dxa"/>
+              <w:bottom w:w="70" w:type="dxa"/>
+              <w:end w:w="90" w:type="dxa"/>
+            </w:tcMar>
+          </w:tcPr>
+          <w:p>
+            <w:pPr>
+              <w:spacing w:line="240" w:lineRule="auto"/>
+              <w:ind w:firstLine="0"/>
+            </w:pPr>
+            <w:r>
+              <w:rPr>
+                <w:rFonts w:ascii="Times New Roman" w:hAnsi="Times New Roman" w:eastAsia="Times New Roman" w:cs="Times New Roman"/>
+                <w:b w:val="0"/>
+                <w:i w:val="0"/>
+                <w:color w:val="000000"/>
+                <w:sz w:val="21"/>
+              </w:rPr>
+              <w:t>Pengecualian bootloader PyInstaller dan kewajiban LGPL pystray dipertahankan pada distribusi yang menggunakannya.</w:t>
+            </w:r>
+          </w:p>
+        </w:tc>
+      </w:tr>
+      <w:tr>
+        <w:trPr>
+          <w:cantSplit/>
+        </w:trPr>
+        <w:tc>
+          <w:tcPr>
+            <w:tcW w:type="dxa" w:w="2608"/>
+            <w:vAlign w:val="top"/>
+            <w:shd w:fill="FFFFFF"/>
+            <w:tcMar>
+              <w:top w:w="70" w:type="dxa"/>
+              <w:start w:w="90" w:type="dxa"/>
+              <w:bottom w:w="70" w:type="dxa"/>
+              <w:end w:w="90" w:type="dxa"/>
+            </w:tcMar>
+          </w:tcPr>
+          <w:p>
+            <w:pPr>
+              <w:spacing w:line="240" w:lineRule="auto"/>
+              <w:ind w:firstLine="0"/>
+            </w:pPr>
+            <w:r>
+              <w:rPr>
+                <w:rFonts w:ascii="Times New Roman" w:hAnsi="Times New Roman" w:eastAsia="Times New Roman" w:cs="Times New Roman"/>
+                <w:b w:val="0"/>
+                <w:i w:val="0"/>
+                <w:color w:val="000000"/>
+                <w:sz w:val="21"/>
+              </w:rPr>
+              <w:t>OCR opsional</w:t>
+            </w:r>
+          </w:p>
+        </w:tc>
+        <w:tc>
+          <w:tcPr>
+            <w:tcW w:type="dxa" w:w="6746"/>
+            <w:vAlign w:val="top"/>
+            <w:shd w:fill="FFFFFF"/>
+            <w:tcMar>
+              <w:top w:w="70" w:type="dxa"/>
+              <w:start w:w="90" w:type="dxa"/>
+              <w:bottom w:w="70" w:type="dxa"/>
+              <w:end w:w="90" w:type="dxa"/>
+            </w:tcMar>
+          </w:tcPr>
+          <w:p>
+            <w:pPr>
+              <w:spacing w:line="240" w:lineRule="auto"/>
+              <w:ind w:firstLine="0"/>
+            </w:pPr>
+            <w:r>
+              <w:rPr>
+                <w:rFonts w:ascii="Times New Roman" w:hAnsi="Times New Roman" w:eastAsia="Times New Roman" w:cs="Times New Roman"/>
+                <w:b w:val="0"/>
+                <w:i w:val="0"/>
+                <w:color w:val="000000"/>
+                <w:sz w:val="21"/>
+              </w:rPr>
+              <w:t>Tesseract menggunakan Apache-2.0 dan hanya dicantumkan sebagai komponen terdistribusi jika benar-benar disertakan dalam build.</w:t>
+            </w:r>
+          </w:p>
+        </w:tc>
+      </w:tr>
+      <w:tr>
+        <w:trPr>
+          <w:cantSplit/>
+        </w:trPr>
+        <w:tc>
+          <w:tcPr>
+            <w:tcW w:type="dxa" w:w="2608"/>
+            <w:vAlign w:val="top"/>
+            <w:shd w:fill="FFFFFF"/>
+            <w:tcMar>
+              <w:top w:w="70" w:type="dxa"/>
+              <w:start w:w="90" w:type="dxa"/>
+              <w:bottom w:w="70" w:type="dxa"/>
+              <w:end w:w="90" w:type="dxa"/>
+            </w:tcMar>
+          </w:tcPr>
+          <w:p>
+            <w:pPr>
+              <w:spacing w:line="240" w:lineRule="auto"/>
+              <w:ind w:firstLine="0"/>
+            </w:pPr>
+            <w:r>
+              <w:rPr>
+                <w:rFonts w:ascii="Times New Roman" w:hAnsi="Times New Roman" w:eastAsia="Times New Roman" w:cs="Times New Roman"/>
+                <w:b w:val="0"/>
+                <w:i w:val="0"/>
+                <w:color w:val="000000"/>
+                <w:sz w:val="21"/>
+              </w:rPr>
+              <w:t>Artefak koleksi</w:t>
+            </w:r>
+          </w:p>
+        </w:tc>
+        <w:tc>
+          <w:tcPr>
+            <w:tcW w:type="dxa" w:w="6746"/>
+            <w:vAlign w:val="top"/>
+            <w:shd w:fill="FFFFFF"/>
+            <w:tcMar>
+              <w:top w:w="70" w:type="dxa"/>
+              <w:start w:w="90" w:type="dxa"/>
+              <w:bottom w:w="70" w:type="dxa"/>
+              <w:end w:w="90" w:type="dxa"/>
+            </w:tcMar>
+          </w:tcPr>
+          <w:p>
+            <w:pPr>
+              <w:spacing w:line="240" w:lineRule="auto"/>
+              <w:ind w:firstLine="0"/>
+            </w:pPr>
+            <w:r>
+              <w:rPr>
+                <w:rFonts w:ascii="Times New Roman" w:hAnsi="Times New Roman" w:eastAsia="Times New Roman" w:cs="Times New Roman"/>
+                <w:b w:val="0"/>
+                <w:i w:val="0"/>
+                <w:color w:val="000000"/>
+                <w:sz w:val="21"/>
+              </w:rPr>
+              <w:t>HTML, tangkapan layar, metadata, dan materi yang dikumpulkan dari web tidak menjadi karya MIT HAWK-EYE. Hak dan ketentuan sumber tetap berlaku.</w:t>
             </w:r>
           </w:p>
         </w:tc>
@@ -1533,27 +1894,1268 @@
     </w:tbl>
     <w:p>
       <w:pPr>
-        <w:spacing w:after="0"/>
+        <w:pStyle w:val="Heading1"/>
       </w:pPr>
+      <w:r>
+        <w:rPr>
+          <w:rFonts w:ascii="Times New Roman" w:hAnsi="Times New Roman" w:eastAsia="Times New Roman" w:cs="Times New Roman"/>
+          <w:b w:val="0"/>
+          <w:i w:val="0"/>
+          <w:color w:val="000000"/>
+          <w:sz w:val="24"/>
+        </w:rPr>
+        <w:t>6. Penerapan pada Distribusi</w:t>
+      </w:r>
     </w:p>
     <w:p>
       <w:pPr>
-        <w:pStyle w:val="Heading2"/>
+        <w:spacing w:line="360" w:lineRule="auto" w:after="0"/>
+        <w:ind w:firstLine="425"/>
+        <w:jc w:val="both"/>
       </w:pPr>
       <w:r>
-        <w:t>7. Pernyataan adopsi</w:t>
+        <w:rPr>
+          <w:rFonts w:ascii="Times New Roman" w:hAnsi="Times New Roman" w:eastAsia="Times New Roman" w:cs="Times New Roman"/>
+          <w:b w:val="0"/>
+          <w:i w:val="0"/>
+          <w:color w:val="000000"/>
+          <w:sz w:val="24"/>
+        </w:rPr>
+        <w:t>Penerapan lisensi dilakukan pada repositori sumber dan setiap format distribusi HAWK-EYE, termasuk source, wheel, container, portable ZIP, dan installer Windows. Setiap rilis mengikuti ketentuan berikut:</w:t>
       </w:r>
     </w:p>
     <w:p>
+      <w:pPr>
+        <w:spacing w:line="360" w:lineRule="auto"/>
+        <w:ind w:left="510" w:hanging="369"/>
+      </w:pPr>
       <w:r>
-        <w:t>Mulai 13 Agustus 2026, HAWK-EYE versi 1.0.0 menggunakan MIT License untuk karya asli proyek, dengan seluruh lisensi dan notice pihak ketiga tetap berlaku secara independen. Identitas dan tanda tangan pihak yang berwenang, apabila diminta panitia, dilengkapi oleh ketua tim pada berkas pernyataan resmi.</w:t>
+        <w:rPr>
+          <w:rFonts w:ascii="Times New Roman" w:hAnsi="Times New Roman" w:eastAsia="Times New Roman" w:cs="Times New Roman"/>
+          <w:b w:val="0"/>
+          <w:i w:val="0"/>
+          <w:color w:val="000000"/>
+          <w:sz w:val="24"/>
+        </w:rPr>
+        <w:t xml:space="preserve">1. </w:t>
+      </w:r>
+      <w:r>
+        <w:rPr>
+          <w:rFonts w:ascii="Times New Roman" w:hAnsi="Times New Roman" w:eastAsia="Times New Roman" w:cs="Times New Roman"/>
+          <w:b w:val="0"/>
+          <w:i w:val="0"/>
+          <w:color w:val="000000"/>
+          <w:sz w:val="24"/>
+        </w:rPr>
+        <w:t>Teks MIT License dan pemberitahuan hak cipta HAWK-EYE disertakan pada salinan atau bagian substansial perangkat lunak.</w:t>
+      </w:r>
+    </w:p>
+    <w:p>
+      <w:pPr>
+        <w:spacing w:line="360" w:lineRule="auto"/>
+        <w:ind w:left="510" w:hanging="369"/>
+      </w:pPr>
+      <w:r>
+        <w:rPr>
+          <w:rFonts w:ascii="Times New Roman" w:hAnsi="Times New Roman" w:eastAsia="Times New Roman" w:cs="Times New Roman"/>
+          <w:b w:val="0"/>
+          <w:i w:val="0"/>
+          <w:color w:val="000000"/>
+          <w:sz w:val="24"/>
+        </w:rPr>
+        <w:t xml:space="preserve">2. </w:t>
+      </w:r>
+      <w:r>
+        <w:rPr>
+          <w:rFonts w:ascii="Times New Roman" w:hAnsi="Times New Roman" w:eastAsia="Times New Roman" w:cs="Times New Roman"/>
+          <w:b w:val="0"/>
+          <w:i w:val="0"/>
+          <w:color w:val="000000"/>
+          <w:sz w:val="24"/>
+        </w:rPr>
+        <w:t>Lisensi dan notice pihak ketiga yang berlaku disertakan sesuai komponen yang benar-benar terdapat dalam artefak distribusi.</w:t>
+      </w:r>
+    </w:p>
+    <w:p>
+      <w:pPr>
+        <w:spacing w:line="360" w:lineRule="auto"/>
+        <w:ind w:left="510" w:hanging="369"/>
+      </w:pPr>
+      <w:r>
+        <w:rPr>
+          <w:rFonts w:ascii="Times New Roman" w:hAnsi="Times New Roman" w:eastAsia="Times New Roman" w:cs="Times New Roman"/>
+          <w:b w:val="0"/>
+          <w:i w:val="0"/>
+          <w:color w:val="000000"/>
+          <w:sz w:val="24"/>
+        </w:rPr>
+        <w:t xml:space="preserve">3. </w:t>
+      </w:r>
+      <w:r>
+        <w:rPr>
+          <w:rFonts w:ascii="Times New Roman" w:hAnsi="Times New Roman" w:eastAsia="Times New Roman" w:cs="Times New Roman"/>
+          <w:b w:val="0"/>
+          <w:i w:val="0"/>
+          <w:color w:val="000000"/>
+          <w:sz w:val="24"/>
+        </w:rPr>
+        <w:t>Kewajiban OFL, LGPL, MPL, Apache, BSD, Creative Commons, PSF, dan lisensi toolchain khusus dipertahankan secara independen.</w:t>
+      </w:r>
+    </w:p>
+    <w:p>
+      <w:pPr>
+        <w:spacing w:line="360" w:lineRule="auto"/>
+        <w:ind w:left="510" w:hanging="369"/>
+      </w:pPr>
+      <w:r>
+        <w:rPr>
+          <w:rFonts w:ascii="Times New Roman" w:hAnsi="Times New Roman" w:eastAsia="Times New Roman" w:cs="Times New Roman"/>
+          <w:b w:val="0"/>
+          <w:i w:val="0"/>
+          <w:color w:val="000000"/>
+          <w:sz w:val="24"/>
+        </w:rPr>
+        <w:t xml:space="preserve">4. </w:t>
+      </w:r>
+      <w:r>
+        <w:rPr>
+          <w:rFonts w:ascii="Times New Roman" w:hAnsi="Times New Roman" w:eastAsia="Times New Roman" w:cs="Times New Roman"/>
+          <w:b w:val="0"/>
+          <w:i w:val="0"/>
+          <w:color w:val="000000"/>
+          <w:sz w:val="24"/>
+        </w:rPr>
+        <w:t>Komponen, logo, merek, dan materi pihak ketiga tidak diklaim sebagai karya asli HAWK-EYE.</w:t>
+      </w:r>
+    </w:p>
+    <w:p>
+      <w:pPr>
+        <w:spacing w:line="360" w:lineRule="auto"/>
+        <w:ind w:left="510" w:hanging="369"/>
+      </w:pPr>
+      <w:r>
+        <w:rPr>
+          <w:rFonts w:ascii="Times New Roman" w:hAnsi="Times New Roman" w:eastAsia="Times New Roman" w:cs="Times New Roman"/>
+          <w:b w:val="0"/>
+          <w:i w:val="0"/>
+          <w:color w:val="000000"/>
+          <w:sz w:val="24"/>
+        </w:rPr>
+        <w:t xml:space="preserve">5. </w:t>
+      </w:r>
+      <w:r>
+        <w:rPr>
+          <w:rFonts w:ascii="Times New Roman" w:hAnsi="Times New Roman" w:eastAsia="Times New Roman" w:cs="Times New Roman"/>
+          <w:b w:val="0"/>
+          <w:i w:val="0"/>
+          <w:color w:val="000000"/>
+          <w:sz w:val="24"/>
+        </w:rPr>
+        <w:t>Perubahan pada dependensi, browser bundle, font, OCR, atau toolchain memicu audit lisensi baru sebelum rilis.</w:t>
+      </w:r>
+    </w:p>
+    <w:p>
+      <w:pPr>
+        <w:spacing w:line="360" w:lineRule="auto"/>
+        <w:ind w:left="510" w:hanging="369"/>
+      </w:pPr>
+      <w:r>
+        <w:rPr>
+          <w:rFonts w:ascii="Times New Roman" w:hAnsi="Times New Roman" w:eastAsia="Times New Roman" w:cs="Times New Roman"/>
+          <w:b w:val="0"/>
+          <w:i w:val="0"/>
+          <w:color w:val="000000"/>
+          <w:sz w:val="24"/>
+        </w:rPr>
+        <w:t xml:space="preserve">6. </w:t>
+      </w:r>
+      <w:r>
+        <w:rPr>
+          <w:rFonts w:ascii="Times New Roman" w:hAnsi="Times New Roman" w:eastAsia="Times New Roman" w:cs="Times New Roman"/>
+          <w:b w:val="0"/>
+          <w:i w:val="0"/>
+          <w:color w:val="000000"/>
+          <w:sz w:val="24"/>
+        </w:rPr>
+        <w:t>Versi dan hash SHA-256 artefak dicatat agar paket yang diaudit dapat dibedakan dari build lain.</w:t>
+      </w:r>
+    </w:p>
+    <w:p>
+      <w:pPr>
+        <w:pStyle w:val="Heading1"/>
+      </w:pPr>
+      <w:r>
+        <w:rPr>
+          <w:rFonts w:ascii="Times New Roman" w:hAnsi="Times New Roman" w:eastAsia="Times New Roman" w:cs="Times New Roman"/>
+          <w:b w:val="0"/>
+          <w:i w:val="0"/>
+          <w:color w:val="000000"/>
+          <w:sz w:val="24"/>
+        </w:rPr>
+        <w:t>7. Bukti Penerapan</w:t>
+      </w:r>
+    </w:p>
+    <w:p>
+      <w:pPr>
+        <w:spacing w:line="360" w:lineRule="auto" w:after="0"/>
+        <w:ind w:firstLine="425"/>
+        <w:jc w:val="both"/>
+      </w:pPr>
+      <w:r>
+        <w:rPr>
+          <w:rFonts w:ascii="Times New Roman" w:hAnsi="Times New Roman" w:eastAsia="Times New Roman" w:cs="Times New Roman"/>
+          <w:b w:val="0"/>
+          <w:i w:val="0"/>
+          <w:color w:val="000000"/>
+          <w:sz w:val="24"/>
+        </w:rPr>
+        <w:t>Adopsi lisensi dapat diperiksa melalui berkas dan metadata pada rilis v1.0.0. Tabel berikut menunjukkan bukti, lokasi, dan fungsi setiap bukti.</w:t>
+      </w:r>
+    </w:p>
+    <w:p>
+      <w:pPr>
+        <w:pStyle w:val="Caption"/>
+        <w:keepNext/>
+      </w:pPr>
+      <w:r>
+        <w:rPr>
+          <w:rFonts w:ascii="Times New Roman" w:hAnsi="Times New Roman" w:eastAsia="Times New Roman" w:cs="Times New Roman"/>
+          <w:b w:val="0"/>
+          <w:i/>
+          <w:color w:val="000000"/>
+          <w:sz w:val="22"/>
+        </w:rPr>
+        <w:t>Tabel 3. Bukti penerapan lisensi HAWK-EYE</w:t>
+      </w:r>
+    </w:p>
+    <w:tbl>
+      <w:tblPr>
+        <w:tblW w:type="auto" w:w="0"/>
+        <w:jc w:val="center"/>
+        <w:tblLayout w:type="fixed"/>
+        <w:tblLook w:firstColumn="1" w:firstRow="1" w:lastColumn="0" w:lastRow="0" w:noHBand="0" w:noVBand="1" w:val="04A0"/>
+        <w:tblBorders>
+          <w:top w:val="single" w:sz="4" w:color="808080"/>
+          <w:left w:val="single" w:sz="4" w:color="808080"/>
+          <w:bottom w:val="single" w:sz="4" w:color="808080"/>
+          <w:right w:val="single" w:sz="4" w:color="808080"/>
+          <w:insideH w:val="single" w:sz="4" w:color="808080"/>
+          <w:insideV w:val="single" w:sz="4" w:color="808080"/>
+        </w:tblBorders>
+      </w:tblPr>
+      <w:tblGrid>
+        <w:gridCol w:w="3024"/>
+        <w:gridCol w:w="3024"/>
+        <w:gridCol w:w="3024"/>
+      </w:tblGrid>
+      <w:tr>
+        <w:trPr>
+          <w:tblHeader w:val="true"/>
+          <w:cantSplit/>
+        </w:trPr>
+        <w:tc>
+          <w:tcPr>
+            <w:tcW w:type="dxa" w:w="2098"/>
+            <w:vAlign w:val="center"/>
+            <w:shd w:fill="FFFFFF"/>
+            <w:tcMar>
+              <w:top w:w="70" w:type="dxa"/>
+              <w:start w:w="90" w:type="dxa"/>
+              <w:bottom w:w="70" w:type="dxa"/>
+              <w:end w:w="90" w:type="dxa"/>
+            </w:tcMar>
+          </w:tcPr>
+          <w:p>
+            <w:pPr>
+              <w:jc w:val="center"/>
+            </w:pPr>
+            <w:r>
+              <w:rPr>
+                <w:rFonts w:ascii="Times New Roman" w:hAnsi="Times New Roman" w:eastAsia="Times New Roman" w:cs="Times New Roman"/>
+                <w:b/>
+                <w:i w:val="0"/>
+                <w:color w:val="000000"/>
+                <w:sz w:val="19"/>
+              </w:rPr>
+              <w:t>Bukti</w:t>
+            </w:r>
+          </w:p>
+        </w:tc>
+        <w:tc>
+          <w:tcPr>
+            <w:tcW w:type="dxa" w:w="3005"/>
+            <w:vAlign w:val="center"/>
+            <w:shd w:fill="FFFFFF"/>
+            <w:tcMar>
+              <w:top w:w="70" w:type="dxa"/>
+              <w:start w:w="90" w:type="dxa"/>
+              <w:bottom w:w="70" w:type="dxa"/>
+              <w:end w:w="90" w:type="dxa"/>
+            </w:tcMar>
+          </w:tcPr>
+          <w:p>
+            <w:pPr>
+              <w:jc w:val="center"/>
+            </w:pPr>
+            <w:r>
+              <w:rPr>
+                <w:rFonts w:ascii="Times New Roman" w:hAnsi="Times New Roman" w:eastAsia="Times New Roman" w:cs="Times New Roman"/>
+                <w:b/>
+                <w:i w:val="0"/>
+                <w:color w:val="000000"/>
+                <w:sz w:val="19"/>
+              </w:rPr>
+              <w:t>Lokasi</w:t>
+            </w:r>
+          </w:p>
+        </w:tc>
+        <w:tc>
+          <w:tcPr>
+            <w:tcW w:type="dxa" w:w="4252"/>
+            <w:vAlign w:val="center"/>
+            <w:shd w:fill="FFFFFF"/>
+            <w:tcMar>
+              <w:top w:w="70" w:type="dxa"/>
+              <w:start w:w="90" w:type="dxa"/>
+              <w:bottom w:w="70" w:type="dxa"/>
+              <w:end w:w="90" w:type="dxa"/>
+            </w:tcMar>
+          </w:tcPr>
+          <w:p>
+            <w:pPr>
+              <w:jc w:val="center"/>
+            </w:pPr>
+            <w:r>
+              <w:rPr>
+                <w:rFonts w:ascii="Times New Roman" w:hAnsi="Times New Roman" w:eastAsia="Times New Roman" w:cs="Times New Roman"/>
+                <w:b/>
+                <w:i w:val="0"/>
+                <w:color w:val="000000"/>
+                <w:sz w:val="19"/>
+              </w:rPr>
+              <w:t>Fungsi</w:t>
+            </w:r>
+          </w:p>
+        </w:tc>
+      </w:tr>
+      <w:tr>
+        <w:trPr>
+          <w:cantSplit/>
+        </w:trPr>
+        <w:tc>
+          <w:tcPr>
+            <w:tcW w:type="dxa" w:w="2098"/>
+            <w:vAlign w:val="top"/>
+            <w:shd w:fill="FFFFFF"/>
+            <w:tcMar>
+              <w:top w:w="70" w:type="dxa"/>
+              <w:start w:w="90" w:type="dxa"/>
+              <w:bottom w:w="70" w:type="dxa"/>
+              <w:end w:w="90" w:type="dxa"/>
+            </w:tcMar>
+          </w:tcPr>
+          <w:p>
+            <w:pPr>
+              <w:spacing w:line="240" w:lineRule="auto"/>
+              <w:ind w:firstLine="0"/>
+            </w:pPr>
+            <w:r>
+              <w:rPr>
+                <w:rFonts w:ascii="Times New Roman" w:hAnsi="Times New Roman" w:eastAsia="Times New Roman" w:cs="Times New Roman"/>
+                <w:b w:val="0"/>
+                <w:i w:val="0"/>
+                <w:color w:val="000000"/>
+                <w:sz w:val="19"/>
+              </w:rPr>
+              <w:t>Repositori sumber</w:t>
+            </w:r>
+          </w:p>
+        </w:tc>
+        <w:tc>
+          <w:tcPr>
+            <w:tcW w:type="dxa" w:w="3005"/>
+            <w:vAlign w:val="top"/>
+            <w:shd w:fill="FFFFFF"/>
+            <w:tcMar>
+              <w:top w:w="70" w:type="dxa"/>
+              <w:start w:w="90" w:type="dxa"/>
+              <w:bottom w:w="70" w:type="dxa"/>
+              <w:end w:w="90" w:type="dxa"/>
+            </w:tcMar>
+          </w:tcPr>
+          <w:p>
+            <w:pPr>
+              <w:spacing w:line="240" w:lineRule="auto"/>
+              <w:ind w:firstLine="0"/>
+            </w:pPr>
+            <w:r>
+              <w:rPr>
+                <w:rFonts w:ascii="Times New Roman" w:hAnsi="Times New Roman" w:eastAsia="Times New Roman" w:cs="Times New Roman"/>
+                <w:b w:val="0"/>
+                <w:i w:val="0"/>
+                <w:color w:val="000000"/>
+                <w:sz w:val="19"/>
+              </w:rPr>
+              <w:t>https://github.com/myudak/hawkeye-judolgraph</w:t>
+            </w:r>
+          </w:p>
+        </w:tc>
+        <w:tc>
+          <w:tcPr>
+            <w:tcW w:type="dxa" w:w="4252"/>
+            <w:vAlign w:val="top"/>
+            <w:shd w:fill="FFFFFF"/>
+            <w:tcMar>
+              <w:top w:w="70" w:type="dxa"/>
+              <w:start w:w="90" w:type="dxa"/>
+              <w:bottom w:w="70" w:type="dxa"/>
+              <w:end w:w="90" w:type="dxa"/>
+            </w:tcMar>
+          </w:tcPr>
+          <w:p>
+            <w:pPr>
+              <w:spacing w:line="240" w:lineRule="auto"/>
+              <w:ind w:firstLine="0"/>
+            </w:pPr>
+            <w:r>
+              <w:rPr>
+                <w:rFonts w:ascii="Times New Roman" w:hAnsi="Times New Roman" w:eastAsia="Times New Roman" w:cs="Times New Roman"/>
+                <w:b w:val="0"/>
+                <w:i w:val="0"/>
+                <w:color w:val="000000"/>
+                <w:sz w:val="19"/>
+              </w:rPr>
+              <w:t>Menyediakan kode sumber dan riwayat versi yang dilisensikan.</w:t>
+            </w:r>
+          </w:p>
+        </w:tc>
+      </w:tr>
+      <w:tr>
+        <w:trPr>
+          <w:cantSplit/>
+        </w:trPr>
+        <w:tc>
+          <w:tcPr>
+            <w:tcW w:type="dxa" w:w="2098"/>
+            <w:vAlign w:val="top"/>
+            <w:shd w:fill="FFFFFF"/>
+            <w:tcMar>
+              <w:top w:w="70" w:type="dxa"/>
+              <w:start w:w="90" w:type="dxa"/>
+              <w:bottom w:w="70" w:type="dxa"/>
+              <w:end w:w="90" w:type="dxa"/>
+            </w:tcMar>
+          </w:tcPr>
+          <w:p>
+            <w:pPr>
+              <w:spacing w:line="240" w:lineRule="auto"/>
+              <w:ind w:firstLine="0"/>
+            </w:pPr>
+            <w:r>
+              <w:rPr>
+                <w:rFonts w:ascii="Times New Roman" w:hAnsi="Times New Roman" w:eastAsia="Times New Roman" w:cs="Times New Roman"/>
+                <w:b w:val="0"/>
+                <w:i w:val="0"/>
+                <w:color w:val="000000"/>
+                <w:sz w:val="19"/>
+              </w:rPr>
+              <w:t>Teks MIT</w:t>
+            </w:r>
+          </w:p>
+        </w:tc>
+        <w:tc>
+          <w:tcPr>
+            <w:tcW w:type="dxa" w:w="3005"/>
+            <w:vAlign w:val="top"/>
+            <w:shd w:fill="FFFFFF"/>
+            <w:tcMar>
+              <w:top w:w="70" w:type="dxa"/>
+              <w:start w:w="90" w:type="dxa"/>
+              <w:bottom w:w="70" w:type="dxa"/>
+              <w:end w:w="90" w:type="dxa"/>
+            </w:tcMar>
+          </w:tcPr>
+          <w:p>
+            <w:pPr>
+              <w:spacing w:line="240" w:lineRule="auto"/>
+              <w:ind w:firstLine="0"/>
+            </w:pPr>
+            <w:r>
+              <w:rPr>
+                <w:rFonts w:ascii="Times New Roman" w:hAnsi="Times New Roman" w:eastAsia="Times New Roman" w:cs="Times New Roman"/>
+                <w:b w:val="0"/>
+                <w:i w:val="0"/>
+                <w:color w:val="000000"/>
+                <w:sz w:val="19"/>
+              </w:rPr>
+              <w:t>LICENSE</w:t>
+            </w:r>
+          </w:p>
+        </w:tc>
+        <w:tc>
+          <w:tcPr>
+            <w:tcW w:type="dxa" w:w="4252"/>
+            <w:vAlign w:val="top"/>
+            <w:shd w:fill="FFFFFF"/>
+            <w:tcMar>
+              <w:top w:w="70" w:type="dxa"/>
+              <w:start w:w="90" w:type="dxa"/>
+              <w:bottom w:w="70" w:type="dxa"/>
+              <w:end w:w="90" w:type="dxa"/>
+            </w:tcMar>
+          </w:tcPr>
+          <w:p>
+            <w:pPr>
+              <w:spacing w:line="240" w:lineRule="auto"/>
+              <w:ind w:firstLine="0"/>
+            </w:pPr>
+            <w:r>
+              <w:rPr>
+                <w:rFonts w:ascii="Times New Roman" w:hAnsi="Times New Roman" w:eastAsia="Times New Roman" w:cs="Times New Roman"/>
+                <w:b w:val="0"/>
+                <w:i w:val="0"/>
+                <w:color w:val="000000"/>
+                <w:sz w:val="19"/>
+              </w:rPr>
+              <w:t>Memuat teks lisensi untuk karya asli HAWK-EYE.</w:t>
+            </w:r>
+          </w:p>
+        </w:tc>
+      </w:tr>
+      <w:tr>
+        <w:trPr>
+          <w:cantSplit/>
+        </w:trPr>
+        <w:tc>
+          <w:tcPr>
+            <w:tcW w:type="dxa" w:w="2098"/>
+            <w:vAlign w:val="top"/>
+            <w:shd w:fill="FFFFFF"/>
+            <w:tcMar>
+              <w:top w:w="70" w:type="dxa"/>
+              <w:start w:w="90" w:type="dxa"/>
+              <w:bottom w:w="70" w:type="dxa"/>
+              <w:end w:w="90" w:type="dxa"/>
+            </w:tcMar>
+          </w:tcPr>
+          <w:p>
+            <w:pPr>
+              <w:spacing w:line="240" w:lineRule="auto"/>
+              <w:ind w:firstLine="0"/>
+            </w:pPr>
+            <w:r>
+              <w:rPr>
+                <w:rFonts w:ascii="Times New Roman" w:hAnsi="Times New Roman" w:eastAsia="Times New Roman" w:cs="Times New Roman"/>
+                <w:b w:val="0"/>
+                <w:i w:val="0"/>
+                <w:color w:val="000000"/>
+                <w:sz w:val="19"/>
+              </w:rPr>
+              <w:t>Metadata Python</w:t>
+            </w:r>
+          </w:p>
+        </w:tc>
+        <w:tc>
+          <w:tcPr>
+            <w:tcW w:type="dxa" w:w="3005"/>
+            <w:vAlign w:val="top"/>
+            <w:shd w:fill="FFFFFF"/>
+            <w:tcMar>
+              <w:top w:w="70" w:type="dxa"/>
+              <w:start w:w="90" w:type="dxa"/>
+              <w:bottom w:w="70" w:type="dxa"/>
+              <w:end w:w="90" w:type="dxa"/>
+            </w:tcMar>
+          </w:tcPr>
+          <w:p>
+            <w:pPr>
+              <w:spacing w:line="240" w:lineRule="auto"/>
+              <w:ind w:firstLine="0"/>
+            </w:pPr>
+            <w:r>
+              <w:rPr>
+                <w:rFonts w:ascii="Times New Roman" w:hAnsi="Times New Roman" w:eastAsia="Times New Roman" w:cs="Times New Roman"/>
+                <w:b w:val="0"/>
+                <w:i w:val="0"/>
+                <w:color w:val="000000"/>
+                <w:sz w:val="19"/>
+              </w:rPr>
+              <w:t>pyproject.toml</w:t>
+            </w:r>
+          </w:p>
+        </w:tc>
+        <w:tc>
+          <w:tcPr>
+            <w:tcW w:type="dxa" w:w="4252"/>
+            <w:vAlign w:val="top"/>
+            <w:shd w:fill="FFFFFF"/>
+            <w:tcMar>
+              <w:top w:w="70" w:type="dxa"/>
+              <w:start w:w="90" w:type="dxa"/>
+              <w:bottom w:w="70" w:type="dxa"/>
+              <w:end w:w="90" w:type="dxa"/>
+            </w:tcMar>
+          </w:tcPr>
+          <w:p>
+            <w:pPr>
+              <w:spacing w:line="240" w:lineRule="auto"/>
+              <w:ind w:firstLine="0"/>
+            </w:pPr>
+            <w:r>
+              <w:rPr>
+                <w:rFonts w:ascii="Times New Roman" w:hAnsi="Times New Roman" w:eastAsia="Times New Roman" w:cs="Times New Roman"/>
+                <w:b w:val="0"/>
+                <w:i w:val="0"/>
+                <w:color w:val="000000"/>
+                <w:sz w:val="19"/>
+              </w:rPr>
+              <w:t>Mendeklarasikan lisensi MIT pada paket Python versi 1.0.0.</w:t>
+            </w:r>
+          </w:p>
+        </w:tc>
+      </w:tr>
+      <w:tr>
+        <w:trPr>
+          <w:cantSplit/>
+        </w:trPr>
+        <w:tc>
+          <w:tcPr>
+            <w:tcW w:type="dxa" w:w="2098"/>
+            <w:vAlign w:val="top"/>
+            <w:shd w:fill="FFFFFF"/>
+            <w:tcMar>
+              <w:top w:w="70" w:type="dxa"/>
+              <w:start w:w="90" w:type="dxa"/>
+              <w:bottom w:w="70" w:type="dxa"/>
+              <w:end w:w="90" w:type="dxa"/>
+            </w:tcMar>
+          </w:tcPr>
+          <w:p>
+            <w:pPr>
+              <w:spacing w:line="240" w:lineRule="auto"/>
+              <w:ind w:firstLine="0"/>
+            </w:pPr>
+            <w:r>
+              <w:rPr>
+                <w:rFonts w:ascii="Times New Roman" w:hAnsi="Times New Roman" w:eastAsia="Times New Roman" w:cs="Times New Roman"/>
+                <w:b w:val="0"/>
+                <w:i w:val="0"/>
+                <w:color w:val="000000"/>
+                <w:sz w:val="19"/>
+              </w:rPr>
+              <w:t>Metadata workspace</w:t>
+            </w:r>
+          </w:p>
+        </w:tc>
+        <w:tc>
+          <w:tcPr>
+            <w:tcW w:type="dxa" w:w="3005"/>
+            <w:vAlign w:val="top"/>
+            <w:shd w:fill="FFFFFF"/>
+            <w:tcMar>
+              <w:top w:w="70" w:type="dxa"/>
+              <w:start w:w="90" w:type="dxa"/>
+              <w:bottom w:w="70" w:type="dxa"/>
+              <w:end w:w="90" w:type="dxa"/>
+            </w:tcMar>
+          </w:tcPr>
+          <w:p>
+            <w:pPr>
+              <w:spacing w:line="240" w:lineRule="auto"/>
+              <w:ind w:firstLine="0"/>
+            </w:pPr>
+            <w:r>
+              <w:rPr>
+                <w:rFonts w:ascii="Times New Roman" w:hAnsi="Times New Roman" w:eastAsia="Times New Roman" w:cs="Times New Roman"/>
+                <w:b w:val="0"/>
+                <w:i w:val="0"/>
+                <w:color w:val="000000"/>
+                <w:sz w:val="19"/>
+              </w:rPr>
+              <w:t>package.json</w:t>
+            </w:r>
+          </w:p>
+        </w:tc>
+        <w:tc>
+          <w:tcPr>
+            <w:tcW w:type="dxa" w:w="4252"/>
+            <w:vAlign w:val="top"/>
+            <w:shd w:fill="FFFFFF"/>
+            <w:tcMar>
+              <w:top w:w="70" w:type="dxa"/>
+              <w:start w:w="90" w:type="dxa"/>
+              <w:bottom w:w="70" w:type="dxa"/>
+              <w:end w:w="90" w:type="dxa"/>
+            </w:tcMar>
+          </w:tcPr>
+          <w:p>
+            <w:pPr>
+              <w:spacing w:line="240" w:lineRule="auto"/>
+              <w:ind w:firstLine="0"/>
+            </w:pPr>
+            <w:r>
+              <w:rPr>
+                <w:rFonts w:ascii="Times New Roman" w:hAnsi="Times New Roman" w:eastAsia="Times New Roman" w:cs="Times New Roman"/>
+                <w:b w:val="0"/>
+                <w:i w:val="0"/>
+                <w:color w:val="000000"/>
+                <w:sz w:val="19"/>
+              </w:rPr>
+              <w:t>Mendeklarasikan lisensi MIT pada workspace JavaScript versi 1.0.0.</w:t>
+            </w:r>
+          </w:p>
+        </w:tc>
+      </w:tr>
+      <w:tr>
+        <w:trPr>
+          <w:cantSplit/>
+        </w:trPr>
+        <w:tc>
+          <w:tcPr>
+            <w:tcW w:type="dxa" w:w="2098"/>
+            <w:vAlign w:val="top"/>
+            <w:shd w:fill="FFFFFF"/>
+            <w:tcMar>
+              <w:top w:w="70" w:type="dxa"/>
+              <w:start w:w="90" w:type="dxa"/>
+              <w:bottom w:w="70" w:type="dxa"/>
+              <w:end w:w="90" w:type="dxa"/>
+            </w:tcMar>
+          </w:tcPr>
+          <w:p>
+            <w:pPr>
+              <w:spacing w:line="240" w:lineRule="auto"/>
+              <w:ind w:firstLine="0"/>
+            </w:pPr>
+            <w:r>
+              <w:rPr>
+                <w:rFonts w:ascii="Times New Roman" w:hAnsi="Times New Roman" w:eastAsia="Times New Roman" w:cs="Times New Roman"/>
+                <w:b w:val="0"/>
+                <w:i w:val="0"/>
+                <w:color w:val="000000"/>
+                <w:sz w:val="19"/>
+              </w:rPr>
+              <w:t>Notice pihak ketiga</w:t>
+            </w:r>
+          </w:p>
+        </w:tc>
+        <w:tc>
+          <w:tcPr>
+            <w:tcW w:type="dxa" w:w="3005"/>
+            <w:vAlign w:val="top"/>
+            <w:shd w:fill="FFFFFF"/>
+            <w:tcMar>
+              <w:top w:w="70" w:type="dxa"/>
+              <w:start w:w="90" w:type="dxa"/>
+              <w:bottom w:w="70" w:type="dxa"/>
+              <w:end w:w="90" w:type="dxa"/>
+            </w:tcMar>
+          </w:tcPr>
+          <w:p>
+            <w:pPr>
+              <w:spacing w:line="240" w:lineRule="auto"/>
+              <w:ind w:firstLine="0"/>
+            </w:pPr>
+            <w:r>
+              <w:rPr>
+                <w:rFonts w:ascii="Times New Roman" w:hAnsi="Times New Roman" w:eastAsia="Times New Roman" w:cs="Times New Roman"/>
+                <w:b w:val="0"/>
+                <w:i w:val="0"/>
+                <w:color w:val="000000"/>
+                <w:sz w:val="19"/>
+              </w:rPr>
+              <w:t>THIRD_PARTY_NOTICES.md</w:t>
+            </w:r>
+          </w:p>
+        </w:tc>
+        <w:tc>
+          <w:tcPr>
+            <w:tcW w:type="dxa" w:w="4252"/>
+            <w:vAlign w:val="top"/>
+            <w:shd w:fill="FFFFFF"/>
+            <w:tcMar>
+              <w:top w:w="70" w:type="dxa"/>
+              <w:start w:w="90" w:type="dxa"/>
+              <w:bottom w:w="70" w:type="dxa"/>
+              <w:end w:w="90" w:type="dxa"/>
+            </w:tcMar>
+          </w:tcPr>
+          <w:p>
+            <w:pPr>
+              <w:spacing w:line="240" w:lineRule="auto"/>
+              <w:ind w:firstLine="0"/>
+            </w:pPr>
+            <w:r>
+              <w:rPr>
+                <w:rFonts w:ascii="Times New Roman" w:hAnsi="Times New Roman" w:eastAsia="Times New Roman" w:cs="Times New Roman"/>
+                <w:b w:val="0"/>
+                <w:i w:val="0"/>
+                <w:color w:val="000000"/>
+                <w:sz w:val="19"/>
+              </w:rPr>
+              <w:t>Mencatat lisensi dan notice komponen pihak ketiga yang digunakan.</w:t>
+            </w:r>
+          </w:p>
+        </w:tc>
+      </w:tr>
+      <w:tr>
+        <w:trPr>
+          <w:cantSplit/>
+        </w:trPr>
+        <w:tc>
+          <w:tcPr>
+            <w:tcW w:type="dxa" w:w="2098"/>
+            <w:vAlign w:val="top"/>
+            <w:shd w:fill="FFFFFF"/>
+            <w:tcMar>
+              <w:top w:w="70" w:type="dxa"/>
+              <w:start w:w="90" w:type="dxa"/>
+              <w:bottom w:w="70" w:type="dxa"/>
+              <w:end w:w="90" w:type="dxa"/>
+            </w:tcMar>
+          </w:tcPr>
+          <w:p>
+            <w:pPr>
+              <w:spacing w:line="240" w:lineRule="auto"/>
+              <w:ind w:firstLine="0"/>
+            </w:pPr>
+            <w:r>
+              <w:rPr>
+                <w:rFonts w:ascii="Times New Roman" w:hAnsi="Times New Roman" w:eastAsia="Times New Roman" w:cs="Times New Roman"/>
+                <w:b w:val="0"/>
+                <w:i w:val="0"/>
+                <w:color w:val="000000"/>
+                <w:sz w:val="19"/>
+              </w:rPr>
+              <w:t>Inventaris komponen</w:t>
+            </w:r>
+          </w:p>
+        </w:tc>
+        <w:tc>
+          <w:tcPr>
+            <w:tcW w:type="dxa" w:w="3005"/>
+            <w:vAlign w:val="top"/>
+            <w:shd w:fill="FFFFFF"/>
+            <w:tcMar>
+              <w:top w:w="70" w:type="dxa"/>
+              <w:start w:w="90" w:type="dxa"/>
+              <w:bottom w:w="70" w:type="dxa"/>
+              <w:end w:w="90" w:type="dxa"/>
+            </w:tcMar>
+          </w:tcPr>
+          <w:p>
+            <w:pPr>
+              <w:spacing w:line="240" w:lineRule="auto"/>
+              <w:ind w:firstLine="0"/>
+            </w:pPr>
+            <w:r>
+              <w:rPr>
+                <w:rFonts w:ascii="Times New Roman" w:hAnsi="Times New Roman" w:eastAsia="Times New Roman" w:cs="Times New Roman"/>
+                <w:b w:val="0"/>
+                <w:i w:val="0"/>
+                <w:color w:val="000000"/>
+                <w:sz w:val="19"/>
+              </w:rPr>
+              <w:t>competition/gemastik-2026/technical/LIBRARIES_AND_LICENSES.md</w:t>
+            </w:r>
+          </w:p>
+        </w:tc>
+        <w:tc>
+          <w:tcPr>
+            <w:tcW w:type="dxa" w:w="4252"/>
+            <w:vAlign w:val="top"/>
+            <w:shd w:fill="FFFFFF"/>
+            <w:tcMar>
+              <w:top w:w="70" w:type="dxa"/>
+              <w:start w:w="90" w:type="dxa"/>
+              <w:bottom w:w="70" w:type="dxa"/>
+              <w:end w:w="90" w:type="dxa"/>
+            </w:tcMar>
+          </w:tcPr>
+          <w:p>
+            <w:pPr>
+              <w:spacing w:line="240" w:lineRule="auto"/>
+              <w:ind w:firstLine="0"/>
+            </w:pPr>
+            <w:r>
+              <w:rPr>
+                <w:rFonts w:ascii="Times New Roman" w:hAnsi="Times New Roman" w:eastAsia="Times New Roman" w:cs="Times New Roman"/>
+                <w:b w:val="0"/>
+                <w:i w:val="0"/>
+                <w:color w:val="000000"/>
+                <w:sz w:val="19"/>
+              </w:rPr>
+              <w:t>Mencatat komponen, versi, fungsi, dan lisensi pada snapshot kompetisi.</w:t>
+            </w:r>
+          </w:p>
+        </w:tc>
+      </w:tr>
+      <w:tr>
+        <w:trPr>
+          <w:cantSplit/>
+        </w:trPr>
+        <w:tc>
+          <w:tcPr>
+            <w:tcW w:type="dxa" w:w="2098"/>
+            <w:vAlign w:val="top"/>
+            <w:shd w:fill="FFFFFF"/>
+            <w:tcMar>
+              <w:top w:w="70" w:type="dxa"/>
+              <w:start w:w="90" w:type="dxa"/>
+              <w:bottom w:w="70" w:type="dxa"/>
+              <w:end w:w="90" w:type="dxa"/>
+            </w:tcMar>
+          </w:tcPr>
+          <w:p>
+            <w:pPr>
+              <w:spacing w:line="240" w:lineRule="auto"/>
+              <w:ind w:firstLine="0"/>
+            </w:pPr>
+            <w:r>
+              <w:rPr>
+                <w:rFonts w:ascii="Times New Roman" w:hAnsi="Times New Roman" w:eastAsia="Times New Roman" w:cs="Times New Roman"/>
+                <w:b w:val="0"/>
+                <w:i w:val="0"/>
+                <w:color w:val="000000"/>
+                <w:sz w:val="19"/>
+              </w:rPr>
+              <w:t>Rilis yang diperiksa</w:t>
+            </w:r>
+          </w:p>
+        </w:tc>
+        <w:tc>
+          <w:tcPr>
+            <w:tcW w:type="dxa" w:w="3005"/>
+            <w:vAlign w:val="top"/>
+            <w:shd w:fill="FFFFFF"/>
+            <w:tcMar>
+              <w:top w:w="70" w:type="dxa"/>
+              <w:start w:w="90" w:type="dxa"/>
+              <w:bottom w:w="70" w:type="dxa"/>
+              <w:end w:w="90" w:type="dxa"/>
+            </w:tcMar>
+          </w:tcPr>
+          <w:p>
+            <w:pPr>
+              <w:spacing w:line="240" w:lineRule="auto"/>
+              <w:ind w:firstLine="0"/>
+            </w:pPr>
+            <w:r>
+              <w:rPr>
+                <w:rFonts w:ascii="Times New Roman" w:hAnsi="Times New Roman" w:eastAsia="Times New Roman" w:cs="Times New Roman"/>
+                <w:b w:val="0"/>
+                <w:i w:val="0"/>
+                <w:color w:val="000000"/>
+                <w:sz w:val="19"/>
+              </w:rPr>
+              <w:t>v1.0.0 / 20beb0cd0062fcf986a16c75d07290a7cbb82048</w:t>
+            </w:r>
+          </w:p>
+        </w:tc>
+        <w:tc>
+          <w:tcPr>
+            <w:tcW w:type="dxa" w:w="4252"/>
+            <w:vAlign w:val="top"/>
+            <w:shd w:fill="FFFFFF"/>
+            <w:tcMar>
+              <w:top w:w="70" w:type="dxa"/>
+              <w:start w:w="90" w:type="dxa"/>
+              <w:bottom w:w="70" w:type="dxa"/>
+              <w:end w:w="90" w:type="dxa"/>
+            </w:tcMar>
+          </w:tcPr>
+          <w:p>
+            <w:pPr>
+              <w:spacing w:line="240" w:lineRule="auto"/>
+              <w:ind w:firstLine="0"/>
+            </w:pPr>
+            <w:r>
+              <w:rPr>
+                <w:rFonts w:ascii="Times New Roman" w:hAnsi="Times New Roman" w:eastAsia="Times New Roman" w:cs="Times New Roman"/>
+                <w:b w:val="0"/>
+                <w:i w:val="0"/>
+                <w:color w:val="000000"/>
+                <w:sz w:val="19"/>
+              </w:rPr>
+              <w:t>Membatasi objek pemeriksaan pada versi dan commit tertentu.</w:t>
+            </w:r>
+          </w:p>
+        </w:tc>
+      </w:tr>
+    </w:tbl>
+    <w:p>
+      <w:pPr>
+        <w:pStyle w:val="Heading1"/>
+      </w:pPr>
+      <w:r>
+        <w:rPr>
+          <w:rFonts w:ascii="Times New Roman" w:hAnsi="Times New Roman" w:eastAsia="Times New Roman" w:cs="Times New Roman"/>
+          <w:b w:val="0"/>
+          <w:i w:val="0"/>
+          <w:color w:val="000000"/>
+          <w:sz w:val="24"/>
+        </w:rPr>
+        <w:t>8. Teks MIT License</w:t>
+      </w:r>
+    </w:p>
+    <w:p>
+      <w:pPr>
+        <w:spacing w:line="360" w:lineRule="auto" w:after="0"/>
+        <w:ind w:firstLine="425"/>
+        <w:jc w:val="both"/>
+      </w:pPr>
+      <w:r>
+        <w:rPr>
+          <w:rFonts w:ascii="Times New Roman" w:hAnsi="Times New Roman" w:eastAsia="Times New Roman" w:cs="Times New Roman"/>
+          <w:b w:val="0"/>
+          <w:i w:val="0"/>
+          <w:color w:val="000000"/>
+          <w:sz w:val="24"/>
+        </w:rPr>
+        <w:t>Teks berikut berlaku untuk karya asli HAWK-EYE. Pencantuman penuh membuat dokumen ini dapat dibaca tanpa bergantung pada berkas eksternal.</w:t>
+      </w:r>
+    </w:p>
+    <w:p>
+      <w:pPr>
+        <w:spacing w:line="240" w:lineRule="auto" w:after="120"/>
+        <w:ind w:firstLine="0"/>
+        <w:jc w:val="left"/>
+      </w:pPr>
+      <w:r>
+        <w:rPr>
+          <w:rFonts w:ascii="Times New Roman" w:hAnsi="Times New Roman" w:eastAsia="Times New Roman" w:cs="Times New Roman"/>
+          <w:b/>
+          <w:i w:val="0"/>
+          <w:color w:val="000000"/>
+          <w:sz w:val="21"/>
+        </w:rPr>
+        <w:t>MIT License</w:t>
+      </w:r>
+    </w:p>
+    <w:p>
+      <w:pPr>
+        <w:spacing w:line="240" w:lineRule="auto" w:after="120"/>
+        <w:ind w:firstLine="0"/>
+        <w:jc w:val="left"/>
+      </w:pPr>
+      <w:r>
+        <w:rPr>
+          <w:rFonts w:ascii="Times New Roman" w:hAnsi="Times New Roman" w:eastAsia="Times New Roman" w:cs="Times New Roman"/>
+          <w:b w:val="0"/>
+          <w:i w:val="0"/>
+          <w:color w:val="000000"/>
+          <w:sz w:val="21"/>
+        </w:rPr>
+        <w:t>Copyright (c) 2026 HAWK-EYE contributors</w:t>
+      </w:r>
+    </w:p>
+    <w:p>
+      <w:pPr>
+        <w:spacing w:line="240" w:lineRule="auto" w:after="180"/>
+        <w:ind w:firstLine="0"/>
+        <w:jc w:val="left"/>
+      </w:pPr>
+      <w:r>
+        <w:rPr>
+          <w:rFonts w:ascii="Times New Roman" w:hAnsi="Times New Roman" w:eastAsia="Times New Roman" w:cs="Times New Roman"/>
+          <w:b w:val="0"/>
+          <w:i w:val="0"/>
+          <w:color w:val="000000"/>
+          <w:sz w:val="21"/>
+        </w:rPr>
+        <w:t>Permission is hereby granted, free of charge, to any person obtaining a copy of this software and associated documentation files (the "Software"), to deal in the Software without restriction, including without limitation the rights to use, copy, modify, merge, publish, distribute, sublicense, and/or sell copies of the Software, and to permit persons to whom the Software is furnished to do so, subject to the following conditions:</w:t>
+      </w:r>
+    </w:p>
+    <w:p>
+      <w:pPr>
+        <w:spacing w:line="240" w:lineRule="auto" w:after="180"/>
+        <w:ind w:firstLine="0"/>
+        <w:jc w:val="left"/>
+      </w:pPr>
+      <w:r>
+        <w:rPr>
+          <w:rFonts w:ascii="Times New Roman" w:hAnsi="Times New Roman" w:eastAsia="Times New Roman" w:cs="Times New Roman"/>
+          <w:b w:val="0"/>
+          <w:i w:val="0"/>
+          <w:color w:val="000000"/>
+          <w:sz w:val="21"/>
+        </w:rPr>
+        <w:t>The above copyright notice and this permission notice shall be included in all copies or substantial portions of the Software.</w:t>
+      </w:r>
+    </w:p>
+    <w:p>
+      <w:pPr>
+        <w:spacing w:line="240" w:lineRule="auto" w:after="180"/>
+        <w:ind w:firstLine="0"/>
+        <w:jc w:val="left"/>
+      </w:pPr>
+      <w:r>
+        <w:rPr>
+          <w:rFonts w:ascii="Times New Roman" w:hAnsi="Times New Roman" w:eastAsia="Times New Roman" w:cs="Times New Roman"/>
+          <w:b w:val="0"/>
+          <w:i w:val="0"/>
+          <w:color w:val="000000"/>
+          <w:sz w:val="21"/>
+        </w:rPr>
+        <w:t>THE SOFTWARE IS PROVIDED "AS IS", WITHOUT WARRANTY OF ANY KIND, EXPRESS OR IMPLIED, INCLUDING BUT NOT LIMITED TO THE WARRANTIES OF MERCHANTABILITY, FITNESS FOR A PARTICULAR PURPOSE AND NONINFRINGEMENT. IN NO EVENT SHALL THE AUTHORS OR COPYRIGHT HOLDERS BE LIABLE FOR ANY CLAIM, DAMAGES OR OTHER LIABILITY, WHETHER IN AN ACTION OF CONTRACT, TORT OR OTHERWISE, ARISING FROM, OUT OF OR IN CONNECTION WITH THE SOFTWARE OR THE USE OR OTHER DEALINGS IN THE SOFTWARE.</w:t>
+      </w:r>
+    </w:p>
+    <w:p>
+      <w:pPr>
+        <w:pStyle w:val="Heading1"/>
+      </w:pPr>
+      <w:r>
+        <w:rPr>
+          <w:rFonts w:ascii="Times New Roman" w:hAnsi="Times New Roman" w:eastAsia="Times New Roman" w:cs="Times New Roman"/>
+          <w:b w:val="0"/>
+          <w:i w:val="0"/>
+          <w:color w:val="000000"/>
+          <w:sz w:val="24"/>
+        </w:rPr>
+        <w:t>9. Pernyataan Akhir</w:t>
+      </w:r>
+    </w:p>
+    <w:p>
+      <w:pPr>
+        <w:spacing w:line="360" w:lineRule="auto" w:after="0"/>
+        <w:ind w:firstLine="425"/>
+        <w:jc w:val="both"/>
+      </w:pPr>
+      <w:r>
+        <w:rPr>
+          <w:rFonts w:ascii="Times New Roman" w:hAnsi="Times New Roman" w:eastAsia="Times New Roman" w:cs="Times New Roman"/>
+          <w:b w:val="0"/>
+          <w:i w:val="0"/>
+          <w:color w:val="000000"/>
+          <w:sz w:val="24"/>
+        </w:rPr>
+        <w:t>Tim Ajarin Kami Sepuh mengadopsi MIT License untuk karya asli HAWK-EYE versi 1.0.0 sejak 13 Agustus 2026. Adopsi ini memberikan izin penggunaan, modifikasi, dan redistribusi sesuai teks MIT tanpa mengalihkan hak atau mengubah lisensi komponen pihak ketiga.</w:t>
+      </w:r>
+    </w:p>
+    <w:p>
+      <w:pPr>
+        <w:pStyle w:val="Heading1"/>
+      </w:pPr>
+      <w:r>
+        <w:rPr>
+          <w:rFonts w:ascii="Times New Roman" w:hAnsi="Times New Roman" w:eastAsia="Times New Roman" w:cs="Times New Roman"/>
+          <w:b w:val="0"/>
+          <w:i w:val="0"/>
+          <w:color w:val="000000"/>
+          <w:sz w:val="24"/>
+        </w:rPr>
+        <w:t>10. Referensi</w:t>
+      </w:r>
+    </w:p>
+    <w:p>
+      <w:pPr>
+        <w:spacing w:line="360" w:lineRule="auto"/>
+        <w:ind w:left="510" w:hanging="369"/>
+      </w:pPr>
+      <w:r>
+        <w:rPr>
+          <w:rFonts w:ascii="Times New Roman" w:hAnsi="Times New Roman" w:eastAsia="Times New Roman" w:cs="Times New Roman"/>
+          <w:b w:val="0"/>
+          <w:i w:val="0"/>
+          <w:color w:val="000000"/>
+          <w:sz w:val="24"/>
+        </w:rPr>
+        <w:t xml:space="preserve">1. </w:t>
+      </w:r>
+      <w:r>
+        <w:rPr>
+          <w:rFonts w:ascii="Times New Roman" w:hAnsi="Times New Roman" w:eastAsia="Times New Roman" w:cs="Times New Roman"/>
+          <w:b w:val="0"/>
+          <w:i w:val="0"/>
+          <w:color w:val="000000"/>
+          <w:sz w:val="24"/>
+        </w:rPr>
+        <w:t>Open Source Initiative. The MIT License. https://opensource.org/license/mit (diakses 14 Agustus 2026).</w:t>
+      </w:r>
+    </w:p>
+    <w:p>
+      <w:pPr>
+        <w:spacing w:line="360" w:lineRule="auto"/>
+        <w:ind w:left="510" w:hanging="369"/>
+      </w:pPr>
+      <w:r>
+        <w:rPr>
+          <w:rFonts w:ascii="Times New Roman" w:hAnsi="Times New Roman" w:eastAsia="Times New Roman" w:cs="Times New Roman"/>
+          <w:b w:val="0"/>
+          <w:i w:val="0"/>
+          <w:color w:val="000000"/>
+          <w:sz w:val="24"/>
+        </w:rPr>
+        <w:t xml:space="preserve">2. </w:t>
+      </w:r>
+      <w:r>
+        <w:rPr>
+          <w:rFonts w:ascii="Times New Roman" w:hAnsi="Times New Roman" w:eastAsia="Times New Roman" w:cs="Times New Roman"/>
+          <w:b w:val="0"/>
+          <w:i w:val="0"/>
+          <w:color w:val="000000"/>
+          <w:sz w:val="24"/>
+        </w:rPr>
+        <w:t>Software Package Data Exchange (SPDX). MIT License, SPDX identifier MIT. https://spdx.org/licenses/MIT.html (diakses 14 Agustus 2026).</w:t>
+      </w:r>
+    </w:p>
+    <w:p>
+      <w:pPr>
+        <w:spacing w:line="360" w:lineRule="auto"/>
+        <w:ind w:left="510" w:hanging="369"/>
+      </w:pPr>
+      <w:r>
+        <w:rPr>
+          <w:rFonts w:ascii="Times New Roman" w:hAnsi="Times New Roman" w:eastAsia="Times New Roman" w:cs="Times New Roman"/>
+          <w:b w:val="0"/>
+          <w:i w:val="0"/>
+          <w:color w:val="000000"/>
+          <w:sz w:val="24"/>
+        </w:rPr>
+        <w:t xml:space="preserve">3. </w:t>
+      </w:r>
+      <w:r>
+        <w:rPr>
+          <w:rFonts w:ascii="Times New Roman" w:hAnsi="Times New Roman" w:eastAsia="Times New Roman" w:cs="Times New Roman"/>
+          <w:b w:val="0"/>
+          <w:i w:val="0"/>
+          <w:color w:val="000000"/>
+          <w:sz w:val="24"/>
+        </w:rPr>
+        <w:t>HAWK-EYE — JudolGraph. Repositori sumber. https://github.com/myudak/hawkeye-judolgraph (diakses 14 Agustus 2026).</w:t>
+      </w:r>
+    </w:p>
+    <w:p>
+      <w:pPr>
+        <w:spacing w:line="360" w:lineRule="auto"/>
+        <w:ind w:left="510" w:hanging="369"/>
+      </w:pPr>
+      <w:r>
+        <w:rPr>
+          <w:rFonts w:ascii="Times New Roman" w:hAnsi="Times New Roman" w:eastAsia="Times New Roman" w:cs="Times New Roman"/>
+          <w:b w:val="0"/>
+          <w:i w:val="0"/>
+          <w:color w:val="000000"/>
+          <w:sz w:val="24"/>
+        </w:rPr>
+        <w:t xml:space="preserve">4. </w:t>
+      </w:r>
+      <w:r>
+        <w:rPr>
+          <w:rFonts w:ascii="Times New Roman" w:hAnsi="Times New Roman" w:eastAsia="Times New Roman" w:cs="Times New Roman"/>
+          <w:b w:val="0"/>
+          <w:i w:val="0"/>
+          <w:color w:val="000000"/>
+          <w:sz w:val="24"/>
+        </w:rPr>
+        <w:t>HAWK-EYE — JudolGraph. Rilis v1.0.0. https://github.com/myudak/hawkeye-judolgraph/releases/tag/v1.0.0 (diakses 14 Agustus 2026).</w:t>
       </w:r>
     </w:p>
     <w:sectPr>
-      <w:headerReference w:type="default" r:id="rId10"/>
-      <w:footerReference w:type="default" r:id="rId11"/>
-      <w:pgSz w:w="12240" w:h="15840"/>
-      <w:pgMar w:top="1080" w:right="1123" w:bottom="1037" w:left="1123" w:header="504" w:footer="504" w:gutter="0"/>
+      <w:headerReference w:type="default" r:id="rId9"/>
+      <w:footerReference w:type="default" r:id="rId10"/>
+      <w:pgSz w:w="11906" w:h="16838"/>
+      <w:pgMar w:top="1417" w:right="1417" w:bottom="1417" w:left="1417" w:header="709" w:footer="709" w:gutter="0"/>
       <w:cols w:space="720"/>
       <w:docGrid w:linePitch="360"/>
     </w:sectPr>
@@ -1566,27 +3168,26 @@
   <w:p>
     <w:pPr>
       <w:pStyle w:val="Footer"/>
-      <w:spacing w:after="0"/>
-      <w:jc w:val="right"/>
+      <w:spacing w:before="0"/>
+      <w:jc w:val="center"/>
     </w:pPr>
     <w:r>
       <w:rPr>
-        <w:color w:val="667085"/>
-        <w:sz w:val="16"/>
-      </w:rPr>
-      <w:t xml:space="preserve">AL-07  •  13 AGUSTUS 2026  •  </w:t>
+        <w:rFonts w:ascii="Times New Roman" w:hAnsi="Times New Roman" w:eastAsia="Times New Roman" w:cs="Times New Roman"/>
+        <w:b w:val="0"/>
+        <w:i w:val="0"/>
+        <w:color w:val="000000"/>
+        <w:sz w:val="20"/>
+      </w:rPr>
+      <w:t xml:space="preserve">Universitas Diponegoro  ·  </w:t>
     </w:r>
     <w:r>
       <w:rPr>
-        <w:color w:val="667085"/>
-        <w:sz w:val="16"/>
-      </w:rPr>
-      <w:t xml:space="preserve">Halaman </w:t>
-    </w:r>
-    <w:r>
-      <w:rPr>
-        <w:color w:val="667085"/>
-        <w:sz w:val="16"/>
+        <w:rFonts w:ascii="Times New Roman" w:hAnsi="Times New Roman" w:eastAsia="Times New Roman" w:cs="Times New Roman"/>
+        <w:b w:val="0"/>
+        <w:i w:val="0"/>
+        <w:color w:val="000000"/>
+        <w:sz w:val="20"/>
       </w:rPr>
       <w:fldChar w:fldCharType="begin"/>
       <w:instrText xml:space="preserve"> PAGE </w:instrText>
@@ -1594,6 +3195,16 @@
       <w:t>1</w:t>
       <w:fldChar w:fldCharType="end"/>
     </w:r>
+  </w:p>
+</w:ftr>
+</file>
+
+<file path=word/footer2.xml><?xml version="1.0" encoding="utf-8"?>
+<w:ftr xmlns:m="http://schemas.openxmlformats.org/officeDocument/2006/math" xmlns:mc="http://schemas.openxmlformats.org/markup-compatibility/2006" xmlns:mo="http://schemas.microsoft.com/office/mac/office/2008/main" xmlns:mv="urn:schemas-microsoft-com:mac:vml" xmlns:o="urn:schemas-microsoft-com:office:office" xmlns:r="http://schemas.openxmlformats.org/officeDocument/2006/relationships" xmlns:v="urn:schemas-microsoft-com:vml" xmlns:w10="urn:schemas-microsoft-com:office:word" xmlns:w14="http://schemas.microsoft.com/office/word/2010/wordml" xmlns:w="http://schemas.openxmlformats.org/wordprocessingml/2006/main" xmlns:wne="http://schemas.microsoft.com/office/word/2006/wordml" xmlns:wp14="http://schemas.microsoft.com/office/word/2010/wordprocessingDrawing" xmlns:wp="http://schemas.openxmlformats.org/drawingml/2006/wordprocessingDrawing" xmlns:wpc="http://schemas.microsoft.com/office/word/2010/wordprocessingCanvas" xmlns:wpg="http://schemas.microsoft.com/office/word/2010/wordprocessingGroup" xmlns:wpi="http://schemas.microsoft.com/office/word/2010/wordprocessingInk" xmlns:wps="http://schemas.microsoft.com/office/word/2010/wordprocessingShape" mc:Ignorable="w14 wp14">
+  <w:p>
+    <w:pPr>
+      <w:pStyle w:val="Footer"/>
+    </w:pPr>
   </w:p>
 </w:ftr>
 </file>
@@ -1605,18 +3216,27 @@
       <w:pStyle w:val="Header"/>
       <w:spacing w:after="0"/>
       <w:jc w:val="right"/>
-      <w:pBdr>
-        <w:bottom w:val="single" w:sz="8" w:space="3" w:color="EC0A6B"/>
-      </w:pBdr>
     </w:pPr>
     <w:r>
       <w:rPr>
-        <w:b/>
-        <w:color w:val="1F4D78"/>
-        <w:sz w:val="16"/>
-      </w:rPr>
-      <w:t>HAWK-EYE  /  GEMASTIK 2026  /  AL-07</w:t>
+        <w:rFonts w:ascii="Times New Roman" w:hAnsi="Times New Roman" w:eastAsia="Times New Roman" w:cs="Times New Roman"/>
+        <w:b w:val="0"/>
+        <w:i w:val="0"/>
+        <w:color w:val="000000"/>
+        <w:sz w:val="18"/>
+      </w:rPr>
+      <w:t>HAWK-EYE — Adopsi Lisensi</w:t>
     </w:r>
+  </w:p>
+</w:hdr>
+</file>
+
+<file path=word/header2.xml><?xml version="1.0" encoding="utf-8"?>
+<w:hdr xmlns:m="http://schemas.openxmlformats.org/officeDocument/2006/math" xmlns:mc="http://schemas.openxmlformats.org/markup-compatibility/2006" xmlns:mo="http://schemas.microsoft.com/office/mac/office/2008/main" xmlns:mv="urn:schemas-microsoft-com:mac:vml" xmlns:o="urn:schemas-microsoft-com:office:office" xmlns:r="http://schemas.openxmlformats.org/officeDocument/2006/relationships" xmlns:v="urn:schemas-microsoft-com:vml" xmlns:w10="urn:schemas-microsoft-com:office:word" xmlns:w14="http://schemas.microsoft.com/office/word/2010/wordml" xmlns:w="http://schemas.openxmlformats.org/wordprocessingml/2006/main" xmlns:wne="http://schemas.microsoft.com/office/word/2006/wordml" xmlns:wp14="http://schemas.microsoft.com/office/word/2010/wordprocessingDrawing" xmlns:wp="http://schemas.openxmlformats.org/drawingml/2006/wordprocessingDrawing" xmlns:wpc="http://schemas.microsoft.com/office/word/2010/wordprocessingCanvas" xmlns:wpg="http://schemas.microsoft.com/office/word/2010/wordprocessingGroup" xmlns:wpi="http://schemas.microsoft.com/office/word/2010/wordprocessingInk" xmlns:wps="http://schemas.microsoft.com/office/word/2010/wordprocessingShape" mc:Ignorable="w14 wp14">
+  <w:p>
+    <w:pPr>
+      <w:pStyle w:val="Header"/>
+    </w:pPr>
   </w:p>
 </w:hdr>
 </file>
@@ -1985,11 +3605,15 @@
     <w:qFormat/>
     <w:rsid w:val="00FC693F"/>
     <w:pPr>
-      <w:spacing w:before="0" w:after="120" w:line="264" w:lineRule="auto"/>
+      <w:widowControl/>
+      <w:spacing w:line="360" w:lineRule="auto" w:before="0" w:after="0"/>
+      <w:ind w:firstLine="425"/>
+      <w:jc w:val="both"/>
     </w:pPr>
     <w:rPr>
-      <w:rFonts w:ascii="Calibri" w:hAnsi="Calibri" w:eastAsia="Calibri"/>
-      <w:sz w:val="22"/>
+      <w:rFonts w:ascii="Times New Roman" w:hAnsi="Times New Roman"/>
+      <w:color w:val="000000"/>
+      <w:sz w:val="24"/>
     </w:rPr>
   </w:style>
   <w:style w:type="paragraph" w:styleId="Header">
@@ -2047,15 +3671,18 @@
     <w:pPr>
       <w:keepNext/>
       <w:keepLines/>
-      <w:spacing w:before="320" w:after="160"/>
+      <w:spacing w:before="240" w:after="120"/>
+      <w:ind w:firstLine="0" w:left="0"/>
+      <w:jc w:val="left"/>
       <w:outlineLvl w:val="0"/>
     </w:pPr>
     <w:rPr>
-      <w:rFonts w:asciiTheme="majorHAnsi" w:eastAsiaTheme="majorEastAsia" w:hAnsiTheme="majorHAnsi" w:cstheme="majorBidi" w:ascii="Calibri" w:hAnsi="Calibri" w:eastAsia="Calibri"/>
+      <w:rFonts w:asciiTheme="majorHAnsi" w:eastAsiaTheme="majorEastAsia" w:hAnsiTheme="majorHAnsi" w:cstheme="majorBidi" w:ascii="Times New Roman" w:hAnsi="Times New Roman"/>
       <w:b/>
       <w:bCs/>
-      <w:color w:val="2E74B5"/>
-      <w:sz w:val="32"/>
+      <w:i w:val="0"/>
+      <w:color w:val="000000"/>
+      <w:sz w:val="24"/>
       <w:szCs w:val="28"/>
     </w:rPr>
   </w:style>
@@ -2071,15 +3698,18 @@
     <w:pPr>
       <w:keepNext/>
       <w:keepLines/>
-      <w:spacing w:before="240" w:after="120"/>
+      <w:spacing w:before="180" w:after="60"/>
+      <w:ind w:firstLine="0" w:left="0"/>
+      <w:jc w:val="left"/>
       <w:outlineLvl w:val="1"/>
     </w:pPr>
     <w:rPr>
-      <w:rFonts w:asciiTheme="majorHAnsi" w:eastAsiaTheme="majorEastAsia" w:hAnsiTheme="majorHAnsi" w:cstheme="majorBidi" w:ascii="Calibri" w:hAnsi="Calibri" w:eastAsia="Calibri"/>
+      <w:rFonts w:asciiTheme="majorHAnsi" w:eastAsiaTheme="majorEastAsia" w:hAnsiTheme="majorHAnsi" w:cstheme="majorBidi" w:ascii="Times New Roman" w:hAnsi="Times New Roman"/>
       <w:b/>
       <w:bCs/>
-      <w:color w:val="2E74B5"/>
-      <w:sz w:val="26"/>
+      <w:i w:val="0"/>
+      <w:color w:val="000000"/>
+      <w:sz w:val="24"/>
       <w:szCs w:val="26"/>
     </w:rPr>
   </w:style>
@@ -2095,14 +3725,17 @@
     <w:pPr>
       <w:keepNext/>
       <w:keepLines/>
-      <w:spacing w:before="160" w:after="80"/>
+      <w:spacing w:before="120" w:after="60"/>
+      <w:ind w:firstLine="0" w:left="0"/>
+      <w:jc w:val="left"/>
       <w:outlineLvl w:val="2"/>
     </w:pPr>
     <w:rPr>
-      <w:rFonts w:asciiTheme="majorHAnsi" w:eastAsiaTheme="majorEastAsia" w:hAnsiTheme="majorHAnsi" w:cstheme="majorBidi" w:ascii="Calibri" w:hAnsi="Calibri" w:eastAsia="Calibri"/>
+      <w:rFonts w:asciiTheme="majorHAnsi" w:eastAsiaTheme="majorEastAsia" w:hAnsiTheme="majorHAnsi" w:cstheme="majorBidi" w:ascii="Times New Roman" w:hAnsi="Times New Roman"/>
       <w:b/>
       <w:bCs/>
-      <w:color w:val="1F4D78"/>
+      <w:i/>
+      <w:color w:val="000000"/>
       <w:sz w:val="24"/>
     </w:rPr>
   </w:style>
@@ -2422,8 +4055,16 @@
     <w:unhideWhenUsed/>
     <w:rsid w:val="00AA1D8D"/>
     <w:pPr>
-      <w:spacing w:after="120"/>
+      <w:widowControl/>
+      <w:spacing w:after="0" w:line="360" w:lineRule="auto" w:before="0"/>
+      <w:ind w:firstLine="425"/>
+      <w:jc w:val="both"/>
     </w:pPr>
+    <w:rPr>
+      <w:rFonts w:ascii="Times New Roman" w:hAnsi="Times New Roman"/>
+      <w:color w:val="000000"/>
+      <w:sz w:val="24"/>
+    </w:rPr>
   </w:style>
   <w:style w:type="character" w:customStyle="1" w:styleId="BodyTextChar">
     <w:name w:val="Body Text Char"/>
@@ -2519,14 +4160,8 @@
       <w:numPr>
         <w:numId w:val="1"/>
       </w:numPr>
-      <w:spacing w:after="160" w:line="280" w:lineRule="auto"/>
-      <w:ind w:left="720" w:hanging="360"/>
       <w:contextualSpacing/>
     </w:pPr>
-    <w:rPr>
-      <w:rFonts w:ascii="Calibri" w:hAnsi="Calibri"/>
-      <w:sz w:val="22"/>
-    </w:rPr>
   </w:style>
   <w:style w:type="paragraph" w:styleId="ListBullet2">
     <w:name w:val="List Bullet 2"/>
@@ -2564,14 +4199,8 @@
       <w:numPr>
         <w:numId w:val="5"/>
       </w:numPr>
-      <w:spacing w:after="160" w:line="280" w:lineRule="auto"/>
-      <w:ind w:left="720" w:hanging="360"/>
       <w:contextualSpacing/>
     </w:pPr>
-    <w:rPr>
-      <w:rFonts w:ascii="Calibri" w:hAnsi="Calibri"/>
-      <w:sz w:val="22"/>
-    </w:rPr>
   </w:style>
   <w:style w:type="paragraph" w:styleId="ListNumber2">
     <w:name w:val="List Number 2"/>
@@ -2792,13 +4421,17 @@
     <w:qFormat/>
     <w:rsid w:val="00FC693F"/>
     <w:pPr>
-      <w:spacing w:line="240" w:lineRule="auto"/>
+      <w:spacing w:line="240" w:lineRule="auto" w:after="60"/>
+      <w:ind w:firstLine="0"/>
+      <w:jc w:val="center"/>
     </w:pPr>
     <w:rPr>
+      <w:rFonts w:ascii="Times New Roman" w:hAnsi="Times New Roman"/>
       <w:b/>
       <w:bCs/>
-      <w:color w:val="4F81BD" w:themeColor="accent1"/>
-      <w:sz w:val="18"/>
+      <w:i/>
+      <w:color w:val="000000"/>
+      <w:sz w:val="22"/>
       <w:szCs w:val="18"/>
     </w:rPr>
   </w:style>
@@ -25535,7 +27168,7 @@
     </a:clrScheme>
     <a:fontScheme name="Office">
       <a:majorFont>
-        <a:latin typeface="Calibri"/>
+        <a:latin typeface="Times New Roman"/>
         <a:ea typeface=""/>
         <a:cs typeface=""/>
         <a:font script="Jpan" typeface="ＭＳ ゴシック"/>
@@ -25570,7 +27203,7 @@
         <a:font script="Geor" typeface="Sylfaen"/>
       </a:majorFont>
       <a:minorFont>
-        <a:latin typeface="Cambria"/>
+        <a:latin typeface="Times New Roman"/>
         <a:ea typeface=""/>
         <a:cs typeface=""/>
         <a:font script="Jpan" typeface="ＭＳ 明朝"/>

</xml_diff>